<commit_message>
docs(ops): Faycal playbook on 3eb72f95 and deploy journal
Refresh the English illustrated Word playbook to the live SHA, with
screenshots of all four beats Shown, and journal the 3eb72f95 switch.

Co-authored-by: thibaud.ishacian <thibaud.ishacian@gmail.com>
</commit_message>
<xml_diff>
--- a/docs/ops/nawa-pr-to-po-live-demo-playbook.docx
+++ b/docs/ops/nawa-pr-to-po-live-demo-playbook.docx
@@ -31,7 +31,15 @@
         <w:rPr>
           <w:i w:val="0"/>
         </w:rPr>
-        <w:t>Live revision at write-up: d46e6bf1a12d51a55582b0c0192ae62a95b63bb6 (hard-reload the tab).</w:t>
+        <w:t>Live revision at write-up: 3eb72f95f6b6b778e039ea5cab215f0d19c6d47f (hard-reload the tab).</w:t>
+      </w:r>
+    </w:p>
+    <w:p>
+      <w:r>
+        <w:rPr>
+          <w:i w:val="0"/>
+        </w:rPr>
+        <w:t>Verified live on this SHA: Read SAP / Summarise / Compose the POST all Shown; Ask turns Shown after a chip or the portal.</w:t>
       </w:r>
     </w:p>
     <w:p>
@@ -215,7 +223,7 @@
               <a:graphicData uri="http://schemas.openxmlformats.org/drawingml/2006/picture">
                 <pic:pic>
                   <pic:nvPicPr>
-                    <pic:cNvPr id="0" name="live_desk_beats.png"/>
+                    <pic:cNvPr id="0" name="live4_desk_top.png"/>
                     <pic:cNvPicPr/>
                   </pic:nvPicPr>
                   <pic:blipFill>
@@ -248,7 +256,7 @@
           <w:color w:val="555555"/>
           <w:sz w:val="18"/>
         </w:rPr>
-        <w:t>Figure 1 — Desk after a live read: Success criteria, four beats, Ask the factory.</w:t>
+        <w:t>Figure 1 — Live desk after Run the factory: Read SAP, Summarise and Compose the POST are Shown. Write stays Sealed.</w:t>
       </w:r>
     </w:p>
     <w:p>
@@ -288,7 +296,7 @@
               <a:graphicData uri="http://schemas.openxmlformats.org/drawingml/2006/picture">
                 <pic:pic>
                   <pic:nvPicPr>
-                    <pic:cNvPr id="0" name="live_sap_kpis.png"/>
+                    <pic:cNvPr id="0" name="live4_dossier.png"/>
                     <pic:cNvPicPr/>
                   </pic:nvPicPr>
                   <pic:blipFill>
@@ -321,7 +329,7 @@
           <w:color w:val="555555"/>
           <w:sz w:val="18"/>
         </w:rPr>
-        <w:t>Figure 2 — Live SAP counts and the sealed POST sitting on the same desk.</w:t>
+        <w:t>Figure 2 — Live SAP counts, stations, and the compiled dossier (STICKER WHITE).</w:t>
       </w:r>
     </w:p>
     <w:p>
@@ -385,11 +393,11 @@
               <a:graphicData uri="http://schemas.openxmlformats.org/drawingml/2006/picture">
                 <pic:pic>
                   <pic:nvPicPr>
-                    <pic:cNvPr id="0" name="live_dossier_summary.png"/>
+                    <pic:cNvPr id="0" name="live4_dossier.png"/>
                     <pic:cNvPicPr/>
                   </pic:nvPicPr>
                   <pic:blipFill>
-                    <a:blip r:embed="rId11"/>
+                    <a:blip r:embed="rId10"/>
                     <a:stretch>
                       <a:fillRect/>
                     </a:stretch>
@@ -418,7 +426,7 @@
           <w:color w:val="555555"/>
           <w:sz w:val="18"/>
         </w:rPr>
-        <w:t>Figure 3 — Compiled dossier: live SAP facts plus the justification summary.</w:t>
+        <w:t>Figure 3 — Compiled dossier: live SAP facts plus the justification summary via azure_llm_v1.</w:t>
       </w:r>
     </w:p>
     <w:p>
@@ -474,11 +482,11 @@
               <a:graphicData uri="http://schemas.openxmlformats.org/drawingml/2006/picture">
                 <pic:pic>
                   <pic:nvPicPr>
-                    <pic:cNvPr id="0" name="live_sealed_post.png"/>
+                    <pic:cNvPr id="0" name="live4_post.png"/>
                     <pic:cNvPicPr/>
                   </pic:nvPicPr>
                   <pic:blipFill>
-                    <a:blip r:embed="rId12"/>
+                    <a:blip r:embed="rId11"/>
                     <a:stretch>
                       <a:fillRect/>
                     </a:stretch>
@@ -587,7 +595,56 @@
               <a:graphicData uri="http://schemas.openxmlformats.org/drawingml/2006/picture">
                 <pic:pic>
                   <pic:nvPicPr>
-                    <pic:cNvPr id="0" name="live_ask_factory.png"/>
+                    <pic:cNvPr id="0" name="live4_ask.png"/>
+                    <pic:cNvPicPr/>
+                  </pic:nvPicPr>
+                  <pic:blipFill>
+                    <a:blip r:embed="rId12"/>
+                    <a:stretch>
+                      <a:fillRect/>
+                    </a:stretch>
+                  </pic:blipFill>
+                  <pic:spPr>
+                    <a:xfrm>
+                      <a:off x="0" y="0"/>
+                      <a:ext cx="5852160" cy="4470400"/>
+                    </a:xfrm>
+                    <a:prstGeom prst="rect"/>
+                  </pic:spPr>
+                </pic:pic>
+              </a:graphicData>
+            </a:graphic>
+          </wp:inline>
+        </w:drawing>
+      </w:r>
+    </w:p>
+    <w:p>
+      <w:pPr>
+        <w:jc w:val="center"/>
+      </w:pPr>
+      <w:r>
+        <w:rPr>
+          <w:i/>
+          <w:color w:val="555555"/>
+          <w:sz w:val="18"/>
+        </w:rPr>
+        <w:t>Figure 5 — Ask the factory: Can we write stays no; write sealed.</w:t>
+      </w:r>
+    </w:p>
+    <w:p>
+      <w:r>
+        <w:drawing>
+          <wp:inline xmlns:a="http://schemas.openxmlformats.org/drawingml/2006/main" xmlns:pic="http://schemas.openxmlformats.org/drawingml/2006/picture">
+            <wp:extent cx="5852160" cy="4470400"/>
+            <wp:docPr id="6" name="Picture 6"/>
+            <wp:cNvGraphicFramePr>
+              <a:graphicFrameLocks noChangeAspect="1"/>
+            </wp:cNvGraphicFramePr>
+            <a:graphic>
+              <a:graphicData uri="http://schemas.openxmlformats.org/drawingml/2006/picture">
+                <pic:pic>
+                  <pic:nvPicPr>
+                    <pic:cNvPr id="0" name="live4_portal.png"/>
                     <pic:cNvPicPr/>
                   </pic:nvPicPr>
                   <pic:blipFill>
@@ -620,56 +677,7 @@
           <w:color w:val="555555"/>
           <w:sz w:val="18"/>
         </w:rPr>
-        <w:t>Figure 5 — Ask the factory chips and the sealed POST in the same scroll.</w:t>
-      </w:r>
-    </w:p>
-    <w:p>
-      <w:r>
-        <w:drawing>
-          <wp:inline xmlns:a="http://schemas.openxmlformats.org/drawingml/2006/main" xmlns:pic="http://schemas.openxmlformats.org/drawingml/2006/picture">
-            <wp:extent cx="5852160" cy="4470400"/>
-            <wp:docPr id="6" name="Picture 6"/>
-            <wp:cNvGraphicFramePr>
-              <a:graphicFrameLocks noChangeAspect="1"/>
-            </wp:cNvGraphicFramePr>
-            <a:graphic>
-              <a:graphicData uri="http://schemas.openxmlformats.org/drawingml/2006/picture">
-                <pic:pic>
-                  <pic:nvPicPr>
-                    <pic:cNvPr id="0" name="live_readonly_portal.png"/>
-                    <pic:cNvPicPr/>
-                  </pic:nvPicPr>
-                  <pic:blipFill>
-                    <a:blip r:embed="rId14"/>
-                    <a:stretch>
-                      <a:fillRect/>
-                    </a:stretch>
-                  </pic:blipFill>
-                  <pic:spPr>
-                    <a:xfrm>
-                      <a:off x="0" y="0"/>
-                      <a:ext cx="5852160" cy="4470400"/>
-                    </a:xfrm>
-                    <a:prstGeom prst="rect"/>
-                  </pic:spPr>
-                </pic:pic>
-              </a:graphicData>
-            </a:graphic>
-          </wp:inline>
-        </w:drawing>
-      </w:r>
-    </w:p>
-    <w:p>
-      <w:pPr>
-        <w:jc w:val="center"/>
-      </w:pPr>
-      <w:r>
-        <w:rPr>
-          <w:i/>
-          <w:color w:val="555555"/>
-          <w:sz w:val="18"/>
-        </w:rPr>
-        <w:t>Figure 6 — Factory portal: read-only, get PR / get PO, no SAP write.</w:t>
+        <w:t>Figure 6 — Factory portal: read-only hint, get PR / get PO, no SAP write.</w:t>
       </w:r>
     </w:p>
     <w:p>
@@ -789,7 +797,7 @@
         <w:pStyle w:val="ListBullet"/>
       </w:pPr>
       <w:r>
-        <w:t>Read SAP waiting: click Run the factory again. A 407 on SAP needs the SAP application restarted, not a new password.</w:t>
+        <w:t>Read SAP waiting: click Run the factory once and wait. A timeout on tools/call often recovers on the next run. A 407 / “Token has expired” on the SAP MCP apps needs those Cloud Foundry applications restarted, not a new Agentium password.</w:t>
       </w:r>
     </w:p>
     <w:p>
@@ -901,7 +909,7 @@
         <w:pStyle w:val="ListBullet"/>
       </w:pPr>
       <w:r>
-        <w:t>Rollback images if this slice misbehaves: AGENTIUM_IMAGE_TAG=38c942896752 then up. Alias demo-agentic was not moved.</w:t>
+        <w:t>Rollback images if this slice misbehaves: AGENTIUM_IMAGE_TAG=d46e6bf1a12d then up. Alias demo-agentic was not moved.</w:t>
       </w:r>
     </w:p>
     <w:p>

</xml_diff>

<commit_message>
docs(ops): operator-desk playbook and cd40fe33 journal
Keep Fayçal's four proofs in the English Word playbook only. The live
desk no longer numbers them.

Co-authored-by: thibaud.ishacian <thibaud.ishacian@gmail.com>
</commit_message>
<xml_diff>
--- a/docs/ops/nawa-pr-to-po-live-demo-playbook.docx
+++ b/docs/ops/nawa-pr-to-po-live-demo-playbook.docx
@@ -31,7 +31,7 @@
         <w:rPr>
           <w:i w:val="0"/>
         </w:rPr>
-        <w:t>Live revision at write-up: 3eb72f95f6b6b778e039ea5cab215f0d19c6d47f (hard-reload the tab).</w:t>
+        <w:t>Live revision: cd40fe337285058120ec7236d587b1853ca72c42 (hard-reload the tab).</w:t>
       </w:r>
     </w:p>
     <w:p>
@@ -39,7 +39,7 @@
         <w:rPr>
           <w:i w:val="0"/>
         </w:rPr>
-        <w:t>Verified live on this SHA: Read SAP / Summarise / Compose the POST all Shown; Ask turns Shown after a chip or the portal.</w:t>
+        <w:t>The desk is a normal operator screen. It does not label demo beats. The reminders below are for you, not for the UI.</w:t>
       </w:r>
     </w:p>
     <w:p>
@@ -47,7 +47,7 @@
         <w:pStyle w:val="Heading2"/>
       </w:pPr>
       <w:r>
-        <w:t>What this demo must show</w:t>
+        <w:t>Reminders for Fayçal (not on screen)</w:t>
       </w:r>
     </w:p>
     <w:p>
@@ -55,7 +55,7 @@
         <w:rPr>
           <w:i w:val="0"/>
         </w:rPr>
-        <w:t>Fayçal’s bar is a clean, live SAP MCP integration. The desk is built so those four proofs sit on one page. Extra factory work (budget, HITL cycle, goods-receipt caution) may appear; it is bonus, not the script.</w:t>
+        <w:t>The bar is a clean, live SAP MCP integration. Walk the desk as an operator. These four proofs are in the work, not in a presenter strip.</w:t>
       </w:r>
     </w:p>
     <w:p>
@@ -63,7 +63,7 @@
         <w:pStyle w:val="ListBullet"/>
       </w:pPr>
       <w:r>
-        <w:t>Beat 1 — Data from SAP. Live tools: get_A_PurchaseRequisitionItem, get_A_PurchaseRequisitionItem_by_key, fi_Validate, get_A_PurReqnAcctAssgmt, get_A_PurchaseOrderItem, get_A_PurchaseOrder.</w:t>
+        <w:t>Live SAP data — KPIs and dossier facts come from get_A_PurchaseRequisitionItem, get_A_PurchaseRequisitionItem_by_key, fi_Validate, get_A_PurReqnAcctAssgmt, get_A_PurchaseOrderItem, get_A_PurchaseOrder.</w:t>
       </w:r>
     </w:p>
     <w:p>
@@ -71,7 +71,7 @@
         <w:pStyle w:val="ListBullet"/>
       </w:pPr>
       <w:r>
-        <w:t>Beat 2 — A small agentic task. Summarise the justification read from SAP (azure_llm_v1). Invent nothing.</w:t>
+        <w:t>Small agentic task — the dossier summarises the justification read from SAP (azure_llm_v1). Invent nothing.</w:t>
       </w:r>
     </w:p>
     <w:p>
@@ -79,7 +79,7 @@
         <w:pStyle w:val="ListBullet"/>
       </w:pPr>
       <w:r>
-        <w:t>Beat 3 — Successful PO posting as a POST request. hikma post_A_PurchaseOrder, method POST, document type NB, station sealed, called: false. Composing the POST is the success.</w:t>
+        <w:t>PO post request — the draft card is hikma post_A_PurchaseOrder, method POST, type NB, sealed, called: false. Composing the POST is the success. Do not send it.</w:t>
       </w:r>
     </w:p>
     <w:p>
@@ -87,7 +87,7 @@
         <w:pStyle w:val="ListBullet"/>
       </w:pPr>
       <w:r>
-        <w:t>Beat 4 (nice to have) — Read-only conversational agent. Desk chips plus the factory portal, using get PR / get PO only.</w:t>
+        <w:t>Read-only questions — Ask the factory / Open the portal. Stay on get PR / get PO. Never claim a SAP write.</w:t>
       </w:r>
     </w:p>
     <w:p>
@@ -95,15 +95,7 @@
         <w:pStyle w:val="ListBullet"/>
       </w:pPr>
       <w:r>
-        <w:t>Honesty line you can say out loud: SAP client 300 has no NB number range; ZAPO is refused by the API. We do not fire a live create. The sealed POST body is the proof.</w:t>
-      </w:r>
-    </w:p>
-    <w:p>
-      <w:pPr>
-        <w:pStyle w:val="Heading2"/>
-      </w:pPr>
-      <w:r>
-        <w:t>Success criteria (say these on stage)</w:t>
+        <w:t>Honesty line: SAP client 300 has no NB number range; ZAPO is refused by the API. We do not fire a live create.</w:t>
       </w:r>
     </w:p>
     <w:p>
@@ -111,39 +103,7 @@
         <w:pStyle w:val="ListBullet"/>
       </w:pPr>
       <w:r>
-        <w:t>Read SAP tile is Shown, and the KPI strip shows live requisitions / tasks / orders with the tool names on the raw cards.</w:t>
-      </w:r>
-    </w:p>
-    <w:p>
-      <w:pPr>
-        <w:pStyle w:val="ListBullet"/>
-      </w:pPr>
-      <w:r>
-        <w:t>Summarise tile is Shown, and the dossier has Justification + Justification summary (via azure_llm_v1).</w:t>
-      </w:r>
-    </w:p>
-    <w:p>
-      <w:pPr>
-        <w:pStyle w:val="ListBullet"/>
-      </w:pPr>
-      <w:r>
-        <w:t>Compose the POST tile is Shown. The card shows POST · hikma · post_A_PurchaseOrder · Sealed, PurchaseOrderType NB, called false.</w:t>
-      </w:r>
-    </w:p>
-    <w:p>
-      <w:pPr>
-        <w:pStyle w:val="ListBullet"/>
-      </w:pPr>
-      <w:r>
-        <w:t>Ask answers from the live counts, or the portal stays on get PR / get PO and never claims a SAP write.</w:t>
-      </w:r>
-    </w:p>
-    <w:p>
-      <w:pPr>
-        <w:pStyle w:val="ListBullet"/>
-      </w:pPr>
-      <w:r>
-        <w:t>Write station stays Sealed for the whole talk. No tools/call on post_A_PurchaseOrder.</w:t>
+        <w:t>Write stays Sealed for the whole talk. No tools/call on post_A_PurchaseOrder. No HANA. No invented YY1_* / A_* aliases.</w:t>
       </w:r>
     </w:p>
     <w:p>
@@ -183,7 +143,7 @@
         <w:pStyle w:val="ListBullet"/>
       </w:pPr>
       <w:r>
-        <w:t>Optional: Connections (/connectors/mcp) if someone asks where SAP / Hikma live. One CONNECTORS card, mcp. Do not open HANA.</w:t>
+        <w:t>Optional: Connections if someone asks where SAP / Hikma live. One CONNECTORS card, mcp. Do not open HANA.</w:t>
       </w:r>
     </w:p>
     <w:p>
@@ -191,7 +151,7 @@
         <w:pStyle w:val="ListBullet"/>
       </w:pPr>
       <w:r>
-        <w:t>Do not press anything that would unseal a write. There is no demo button that creates a PO in SAP.</w:t>
+        <w:t>There is no button that creates a PO in SAP.</w:t>
       </w:r>
     </w:p>
     <w:p>
@@ -199,7 +159,7 @@
         <w:pStyle w:val="Heading2"/>
       </w:pPr>
       <w:r>
-        <w:t>Step 1 — Land on the factory desk</w:t>
+        <w:t>Step 1 — Open the desk</w:t>
       </w:r>
     </w:p>
     <w:p>
@@ -207,7 +167,7 @@
         <w:rPr>
           <w:i w:val="0"/>
         </w:rPr>
-        <w:t>You should see the dark NAWA desk, the lineage Application · System · Run, and the orange Success criteria strip with four numbered tiles.</w:t>
+        <w:t>You land on the NAWA factory desk: lineage, a short briefing, counts, and the station line. No numbered demo tiles.</w:t>
       </w:r>
     </w:p>
     <w:p>
@@ -223,7 +183,7 @@
               <a:graphicData uri="http://schemas.openxmlformats.org/drawingml/2006/picture">
                 <pic:pic>
                   <pic:nvPicPr>
-                    <pic:cNvPr id="0" name="live4_desk_top.png"/>
+                    <pic:cNvPr id="0" name="live5_desk_top.png"/>
                     <pic:cNvPicPr/>
                   </pic:nvPicPr>
                   <pic:blipFill>
@@ -256,7 +216,7 @@
           <w:color w:val="555555"/>
           <w:sz w:val="18"/>
         </w:rPr>
-        <w:t>Figure 1 — Live desk after Run the factory: Read SAP, Summarise and Compose the POST are Shown. Write stays Sealed.</w:t>
+        <w:t>Figure 1 — Operator desk after a live read. Write stays Sealed.</w:t>
       </w:r>
     </w:p>
     <w:p>
@@ -264,7 +224,7 @@
         <w:rPr>
           <w:i w:val="0"/>
         </w:rPr>
-        <w:t>Talk track: “This is the PR to PO factory. It reads Hikma/SAP through MCP, compiles a dossier, and writes nothing until a human decides.”</w:t>
+        <w:t>Talk track: “This is the PR to PO factory. It reads Hikma through MCP, compiles a dossier, and writes nothing until a human decides.”</w:t>
       </w:r>
     </w:p>
     <w:p>
@@ -272,7 +232,7 @@
         <w:pStyle w:val="Heading2"/>
       </w:pPr>
       <w:r>
-        <w:t>Step 2 — Beat 1: we are getting data from SAP</w:t>
+        <w:t>Step 2 — Live SAP data</w:t>
       </w:r>
     </w:p>
     <w:p>
@@ -280,7 +240,7 @@
         <w:rPr>
           <w:i w:val="0"/>
         </w:rPr>
-        <w:t>Click Run the factory (top right) if the tiles are still waiting. Wait until Read SAP turns Shown and the KPI numbers fill in.</w:t>
+        <w:t>Click Run the factory if the counts are still empty. Wait until Requisitions / Tasks / Orders fill in.</w:t>
       </w:r>
     </w:p>
     <w:p>
@@ -296,7 +256,7 @@
               <a:graphicData uri="http://schemas.openxmlformats.org/drawingml/2006/picture">
                 <pic:pic>
                   <pic:nvPicPr>
-                    <pic:cNvPr id="0" name="live4_dossier.png"/>
+                    <pic:cNvPr id="0" name="live5_dossier.png"/>
                     <pic:cNvPicPr/>
                   </pic:nvPicPr>
                   <pic:blipFill>
@@ -329,7 +289,7 @@
           <w:color w:val="555555"/>
           <w:sz w:val="18"/>
         </w:rPr>
-        <w:t>Figure 2 — Live SAP counts, stations, and the compiled dossier (STICKER WHITE).</w:t>
+        <w:t>Figure 2 — Live counts, stations, and the compiled dossier.</w:t>
       </w:r>
     </w:p>
     <w:p>
@@ -337,7 +297,7 @@
         <w:pStyle w:val="ListBullet"/>
       </w:pPr>
       <w:r>
-        <w:t>Point at Requisitions / Tasks / Orders. Those are live MCP reads, not a fixture.</w:t>
+        <w:t>Point at the counts. Those are live MCP reads, not a fixture.</w:t>
       </w:r>
     </w:p>
     <w:p>
@@ -345,7 +305,7 @@
         <w:pStyle w:val="ListBullet"/>
       </w:pPr>
       <w:r>
-        <w:t>Scroll to Raw material. The PR card must say via get_A_PurchaseRequisitionItem. The PO card via get_A_PurchaseOrder / get_A_PurchaseOrderItem.</w:t>
+        <w:t>In the dossier, the selected requisition is via get_A_PurchaseRequisitionItem. Supplier and order type via get_A_PurchaseOrder.</w:t>
       </w:r>
     </w:p>
     <w:p>
@@ -353,7 +313,7 @@
         <w:pStyle w:val="ListBullet"/>
       </w:pPr>
       <w:r>
-        <w:t>The factory line at the bottom: Connect Done · Read Done · Compile Done · Decide Ready · Write Sealed.</w:t>
+        <w:t>Stations: Connect Done · Read Done · Compile Done · Decide Ready · Write Sealed.</w:t>
       </w:r>
     </w:p>
     <w:p>
@@ -361,7 +321,7 @@
         <w:rPr>
           <w:i w:val="0"/>
         </w:rPr>
-        <w:t>If someone asks “is this HANA?”: no. HANA is off. This is the SAP MCP servers (sap, hikma, sap_inbox, sap_gr).</w:t>
+        <w:t>If someone asks “is this HANA?”: no. HANA is off. The servers are sap, hikma, sap_inbox, sap_gr.</w:t>
       </w:r>
     </w:p>
     <w:p>
@@ -369,7 +329,7 @@
         <w:pStyle w:val="Heading2"/>
       </w:pPr>
       <w:r>
-        <w:t>Step 3 — Beat 2: a small agentic task (summarisation)</w:t>
+        <w:t>Step 3 — Justification summary</w:t>
       </w:r>
     </w:p>
     <w:p>
@@ -377,7 +337,7 @@
         <w:rPr>
           <w:i w:val="0"/>
         </w:rPr>
-        <w:t>On tile 2, click Read selected requisition if justification is empty, then Summarise. Wait until the tile turns Shown.</w:t>
+        <w:t>Scroll to Compiled dossier. If justification is empty, click Read selected requisition, then Summarise. The desk also summarises on its own after the first read.</w:t>
       </w:r>
     </w:p>
     <w:p>
@@ -393,7 +353,7 @@
               <a:graphicData uri="http://schemas.openxmlformats.org/drawingml/2006/picture">
                 <pic:pic>
                   <pic:nvPicPr>
-                    <pic:cNvPr id="0" name="live4_dossier.png"/>
+                    <pic:cNvPr id="0" name="live5_dossier.png"/>
                     <pic:cNvPicPr/>
                   </pic:nvPicPr>
                   <pic:blipFill>
@@ -426,7 +386,7 @@
           <w:color w:val="555555"/>
           <w:sz w:val="18"/>
         </w:rPr>
-        <w:t>Figure 3 — Compiled dossier: live SAP facts plus the justification summary via azure_llm_v1.</w:t>
+        <w:t>Figure 3 — Justification from SAP and the short model summary.</w:t>
       </w:r>
     </w:p>
     <w:p>
@@ -450,7 +410,7 @@
         <w:rPr>
           <w:i w:val="0"/>
         </w:rPr>
-        <w:t>Typical live example: selected requisition STICKER WHITE, summary about white stickers. The exact PR can move; the tools must not.</w:t>
+        <w:t>Typical live example: STICKER WHITE. The exact PR can move; the tools must not.</w:t>
       </w:r>
     </w:p>
     <w:p>
@@ -458,7 +418,7 @@
         <w:pStyle w:val="Heading2"/>
       </w:pPr>
       <w:r>
-        <w:t>Step 4 — Beat 3: successful PO POST (sealed)</w:t>
+        <w:t>Step 4 — Draft purchase order (not sent)</w:t>
       </w:r>
     </w:p>
     <w:p>
@@ -466,7 +426,7 @@
         <w:rPr>
           <w:i w:val="0"/>
         </w:rPr>
-        <w:t>Click tile 3 Compose the POST, or scroll to Purchase order composed for SAP.</w:t>
+        <w:t>Scroll to Purchase order composed for SAP.</w:t>
       </w:r>
     </w:p>
     <w:p>
@@ -482,7 +442,7 @@
               <a:graphicData uri="http://schemas.openxmlformats.org/drawingml/2006/picture">
                 <pic:pic>
                   <pic:nvPicPr>
-                    <pic:cNvPr id="0" name="live4_post.png"/>
+                    <pic:cNvPr id="0" name="live5_post.png"/>
                     <pic:cNvPicPr/>
                   </pic:nvPicPr>
                   <pic:blipFill>
@@ -515,7 +475,7 @@
           <w:color w:val="555555"/>
           <w:sz w:val="18"/>
         </w:rPr>
-        <w:t>Figure 4 — Sealed hikma POST: method POST, type NB, called false.</w:t>
+        <w:t>Figure 4 — Draft hikma POST: type NB, sealed, not sent.</w:t>
       </w:r>
     </w:p>
     <w:p>
@@ -523,7 +483,7 @@
         <w:pStyle w:val="ListBullet"/>
       </w:pPr>
       <w:r>
-        <w:t>Read the header aloud: POST · hikma · post_A_PurchaseOrder · Sealed.</w:t>
+        <w:t>Read the header: POST · hikma · post_A_PurchaseOrder · Sealed.</w:t>
       </w:r>
     </w:p>
     <w:p>
@@ -531,7 +491,7 @@
         <w:pStyle w:val="ListBullet"/>
       </w:pPr>
       <w:r>
-        <w:t>Open the JSON: sealed true, called false, PurchaseOrderType NB, Supplier from the live majority supplier, to_PurchaseOrderItem linked to the selected PR.</w:t>
+        <w:t>In the JSON: sealed true, called false, PurchaseOrderType NB, supplier from the live majority, item linked to the selected PR.</w:t>
       </w:r>
     </w:p>
     <w:p>
@@ -539,7 +499,7 @@
         <w:pStyle w:val="ListBullet"/>
       </w:pPr>
       <w:r>
-        <w:t>Read the footnote: Client 300 has no NB number range; ZAPO is refused by the API. Composing the POST is the success of this demo.</w:t>
+        <w:t>Footnote: Client 300 has no NB number range. The API refuses ZAPO.</w:t>
       </w:r>
     </w:p>
     <w:p>
@@ -547,7 +507,7 @@
         <w:rPr>
           <w:i w:val="0"/>
         </w:rPr>
-        <w:t>If someone asks to “just post it”: refuse. The write station stays sealed. A live create would fail on number range / type and would break the contract.</w:t>
+        <w:t>If someone asks to “just post it”: refuse. The write stays sealed.</w:t>
       </w:r>
     </w:p>
     <w:p>
@@ -555,7 +515,7 @@
         <w:pStyle w:val="Heading2"/>
       </w:pPr>
       <w:r>
-        <w:t>Step 5 — Beat 4: read-only questions (get PR / get PO)</w:t>
+        <w:t>Step 5 — Questions</w:t>
       </w:r>
     </w:p>
     <w:p>
@@ -571,7 +531,7 @@
         <w:pStyle w:val="ListBullet"/>
       </w:pPr>
       <w:r>
-        <w:t>Fast: chips under Ask the factory — Majority supplier, Orders read, What next, Can we write. The last one must answer No; the write stays sealed.</w:t>
+        <w:t>Fast: chips under Ask the factory — Majority supplier, Orders read, Next step, Write status. Write status must answer No; the write stays sealed.</w:t>
       </w:r>
     </w:p>
     <w:p>
@@ -579,7 +539,7 @@
         <w:pStyle w:val="ListBullet"/>
       </w:pPr>
       <w:r>
-        <w:t>Conversational: Open the portal. The hint says read only, get PR and get PO, no SAP write. Ask how many requisitions/orders were just read, or who the majority supplier is.</w:t>
+        <w:t>Conversational: Open the portal. Ask how many requisitions/orders were just read, or who the majority supplier is.</w:t>
       </w:r>
     </w:p>
     <w:p>
@@ -595,7 +555,7 @@
               <a:graphicData uri="http://schemas.openxmlformats.org/drawingml/2006/picture">
                 <pic:pic>
                   <pic:nvPicPr>
-                    <pic:cNvPr id="0" name="live4_ask.png"/>
+                    <pic:cNvPr id="0" name="live5_ask.png"/>
                     <pic:cNvPicPr/>
                   </pic:nvPicPr>
                   <pic:blipFill>
@@ -628,7 +588,7 @@
           <w:color w:val="555555"/>
           <w:sz w:val="18"/>
         </w:rPr>
-        <w:t>Figure 5 — Ask the factory: Can we write stays no; write sealed.</w:t>
+        <w:t>Figure 5 — Write status stays no; write sealed.</w:t>
       </w:r>
     </w:p>
     <w:p>
@@ -644,7 +604,7 @@
               <a:graphicData uri="http://schemas.openxmlformats.org/drawingml/2006/picture">
                 <pic:pic>
                   <pic:nvPicPr>
-                    <pic:cNvPr id="0" name="live4_portal.png"/>
+                    <pic:cNvPr id="0" name="live5_portal.png"/>
                     <pic:cNvPicPr/>
                   </pic:nvPicPr>
                   <pic:blipFill>
@@ -677,7 +637,7 @@
           <w:color w:val="555555"/>
           <w:sz w:val="18"/>
         </w:rPr>
-        <w:t>Figure 6 — Factory portal: read-only hint, get PR / get PO, no SAP write.</w:t>
+        <w:t>Figure 6 — Portal on the live reads. Write stays sealed.</w:t>
       </w:r>
     </w:p>
     <w:p>
@@ -701,7 +661,7 @@
         <w:pStyle w:val="ListBullet"/>
       </w:pPr>
       <w:r>
-        <w:t>Start a cycle — opens an observable Run on system PR to PO. HITL may appear. Approve/reject still does not unseal the SAP write.</w:t>
+        <w:t>Start a cycle — opens an observable Run on system PR to PO. Approve/reject still does not unseal the SAP write.</w:t>
       </w:r>
     </w:p>
     <w:p>
@@ -709,7 +669,7 @@
         <w:pStyle w:val="ListBullet"/>
       </w:pPr>
       <w:r>
-        <w:t>Open the Flow / Open the System — shows the published graph. Useful if they want to see the stations, not required for the four beats.</w:t>
+        <w:t>Open the Flow / Open the System — the published graph, not required for the four proofs.</w:t>
       </w:r>
     </w:p>
     <w:p>
@@ -725,7 +685,7 @@
         <w:pStyle w:val="Heading2"/>
       </w:pPr>
       <w:r>
-        <w:t>Seven-minute script (suggested clock)</w:t>
+        <w:t>Seven-minute script</w:t>
       </w:r>
     </w:p>
     <w:p>
@@ -741,7 +701,7 @@
         <w:pStyle w:val="ListBullet"/>
       </w:pPr>
       <w:r>
-        <w:t>0:30 — “Four proofs.” Point at Success criteria.</w:t>
+        <w:t>0:30 — Briefing + counts. “Live SAP, through MCP.”</w:t>
       </w:r>
     </w:p>
     <w:p>
@@ -749,7 +709,7 @@
         <w:pStyle w:val="ListBullet"/>
       </w:pPr>
       <w:r>
-        <w:t>1:00 — Run the factory. Tile 1 Shown. KPI + raw tools.</w:t>
+        <w:t>1:30 — Dossier. Tools on the facts. Justification summary.</w:t>
       </w:r>
     </w:p>
     <w:p>
@@ -757,7 +717,7 @@
         <w:pStyle w:val="ListBullet"/>
       </w:pPr>
       <w:r>
-        <w:t>2:30 — Summarise. Tile 2 Shown. Dossier.</w:t>
+        <w:t>3:00 — Draft order. NB, sealed, not sent. Honesty line.</w:t>
       </w:r>
     </w:p>
     <w:p>
@@ -765,15 +725,7 @@
         <w:pStyle w:val="ListBullet"/>
       </w:pPr>
       <w:r>
-        <w:t>3:30 — POST card. Tile 3 Shown. NB, sealed, honesty line.</w:t>
-      </w:r>
-    </w:p>
-    <w:p>
-      <w:pPr>
-        <w:pStyle w:val="ListBullet"/>
-      </w:pPr>
-      <w:r>
-        <w:t>5:00 — Chip “Can we write?” then Open the portal with a get-PR / get-PO question.</w:t>
+        <w:t>5:00 — Write status, then Open the portal with a get-PR / get-PO question.</w:t>
       </w:r>
     </w:p>
     <w:p>
@@ -789,7 +741,7 @@
         <w:pStyle w:val="Heading2"/>
       </w:pPr>
       <w:r>
-        <w:t>If something is yellow or empty</w:t>
+        <w:t>If something is empty</w:t>
       </w:r>
     </w:p>
     <w:p>
@@ -797,7 +749,7 @@
         <w:pStyle w:val="ListBullet"/>
       </w:pPr>
       <w:r>
-        <w:t>Read SAP waiting: click Run the factory once and wait. A timeout on tools/call often recovers on the next run. A 407 / “Token has expired” on the SAP MCP apps needs those Cloud Foundry applications restarted, not a new Agentium password.</w:t>
+        <w:t>Counts at 0: click Run the factory once and wait. A timeout on tools/call often recovers on the next run. A 407 / “Token has expired” needs the SAP MCP applications restarted, not a new Agentium password.</w:t>
       </w:r>
     </w:p>
     <w:p>
@@ -805,7 +757,7 @@
         <w:pStyle w:val="ListBullet"/>
       </w:pPr>
       <w:r>
-        <w:t>Summarise waiting: wait for justification text, then click Summarise once. Do not spam it.</w:t>
+        <w:t>Empty justification: wait, then Read selected requisition once. Summarise once. Do not spam it.</w:t>
       </w:r>
     </w:p>
     <w:p>
@@ -813,7 +765,7 @@
         <w:pStyle w:val="ListBullet"/>
       </w:pPr>
       <w:r>
-        <w:t>Compose the POST waiting: we need a live PR id and a majority supplier from PO headers. Re-run the factory.</w:t>
+        <w:t>No draft order: we need a live PR id and a majority supplier. Run the factory again.</w:t>
       </w:r>
     </w:p>
     <w:p>
@@ -821,7 +773,7 @@
         <w:pStyle w:val="ListBullet"/>
       </w:pPr>
       <w:r>
-        <w:t>Portal offline: lineage should show system PR to PO. Re-run the factory so the binding is resolved.</w:t>
+        <w:t>Portal offline: lineage should show system PR to PO. Run the factory so the binding is resolved.</w:t>
       </w:r>
     </w:p>
     <w:p>
@@ -909,7 +861,7 @@
         <w:pStyle w:val="ListBullet"/>
       </w:pPr>
       <w:r>
-        <w:t>Rollback images if this slice misbehaves: AGENTIUM_IMAGE_TAG=d46e6bf1a12d then up. Alias demo-agentic was not moved.</w:t>
+        <w:t>The UI does not number the four proofs. Those reminders live only in this document.</w:t>
       </w:r>
     </w:p>
     <w:p>
@@ -917,7 +869,7 @@
         <w:rPr>
           <w:b/>
         </w:rPr>
-        <w:t>End of playbook. Play the four tiles. Leave SAP sealed.</w:t>
+        <w:t>End of playbook. Walk the desk. Leave SAP sealed.</w:t>
       </w:r>
     </w:p>
     <w:sectPr>

</xml_diff>

<commit_message>
docs(ops): Faycal operator-desk playbook (EN, FR, Word)
Align the presenter pack on the live operator desk (cd40fe33): English
handout, one-page French card, illustrated Word from in-repo figures.

Co-authored-by: thibaud.ishacian <thibaud.ishacian@gmail.com>
</commit_message>
<xml_diff>
--- a/docs/ops/nawa-pr-to-po-live-demo-playbook.docx
+++ b/docs/ops/nawa-pr-to-po-live-demo-playbook.docx
@@ -7,21 +7,27 @@
         <w:pStyle w:val="Heading1"/>
       </w:pPr>
       <w:r>
-        <w:t>NAWA PR → PO — live demo playbook</w:t>
+        <w:t>NAWA PR → PO — live desk playbook</w:t>
       </w:r>
     </w:p>
     <w:p>
       <w:r>
         <w:rPr>
+          <w:rFonts w:ascii="Calibri" w:hAnsi="Calibri" w:eastAsia="Calibri"/>
+          <w:b w:val="0"/>
           <w:i w:val="0"/>
+          <w:sz w:val="22"/>
         </w:rPr>
-        <w:t>For Fayçal · English · Agentium factory desk on nawa</w:t>
+        <w:t>For Fayçal and the presenter · Desk language: English</w:t>
       </w:r>
     </w:p>
     <w:p>
       <w:r>
         <w:rPr>
+          <w:rFonts w:ascii="Calibri" w:hAnsi="Calibri" w:eastAsia="Calibri"/>
+          <w:b w:val="0"/>
           <w:i w:val="0"/>
+          <w:sz w:val="22"/>
         </w:rPr>
         <w:t>URL: https://agentium.papai.ai/work/pr-to-po?workspace=nawa&amp;lang=en</w:t>
       </w:r>
@@ -29,17 +35,23 @@
     <w:p>
       <w:r>
         <w:rPr>
+          <w:rFonts w:ascii="Calibri" w:hAnsi="Calibri" w:eastAsia="Calibri"/>
+          <w:b w:val="0"/>
           <w:i w:val="0"/>
+          <w:sz w:val="22"/>
         </w:rPr>
-        <w:t>Live revision: cd40fe337285058120ec7236d587b1853ca72c42 (hard-reload the tab).</w:t>
+        <w:t>Live revision: cd40fe337285058120ec7236d587b1853ca72c42 (hard-reload the tab). Verified 31 August 2026.</w:t>
       </w:r>
     </w:p>
     <w:p>
       <w:r>
         <w:rPr>
+          <w:rFonts w:ascii="Calibri" w:hAnsi="Calibri" w:eastAsia="Calibri"/>
+          <w:b w:val="0"/>
           <w:i w:val="0"/>
+          <w:sz w:val="22"/>
         </w:rPr>
-        <w:t>The desk is a normal operator screen. It does not label demo beats. The reminders below are for you, not for the UI.</w:t>
+        <w:t>This is an operator desk, not a numbered demo script. The four proofs live in this document. On screen you only see work.</w:t>
       </w:r>
     </w:p>
     <w:p>
@@ -47,15 +59,146 @@
         <w:pStyle w:val="Heading2"/>
       </w:pPr>
       <w:r>
-        <w:t>Reminders for Fayçal (not on screen)</w:t>
+        <w:t>Who gets what</w:t>
+      </w:r>
+    </w:p>
+    <w:tbl>
+      <w:tblPr>
+        <w:tblStyle w:val="TableGrid"/>
+        <w:tblW w:type="auto" w:w="0"/>
+        <w:tblLook w:firstColumn="1" w:firstRow="1" w:lastColumn="0" w:lastRow="0" w:noHBand="0" w:noVBand="1" w:val="04A0"/>
+      </w:tblPr>
+      <w:tblGrid>
+        <w:gridCol w:w="4320"/>
+        <w:gridCol w:w="4320"/>
+      </w:tblGrid>
+      <w:tr>
+        <w:tc>
+          <w:tcPr>
+            <w:tcW w:type="dxa" w:w="4320"/>
+          </w:tcPr>
+          <w:p>
+            <w:r/>
+            <w:r>
+              <w:rPr>
+                <w:rFonts w:ascii="Calibri" w:hAnsi="Calibri" w:eastAsia="Calibri"/>
+                <w:b/>
+                <w:i w:val="0"/>
+                <w:sz w:val="20"/>
+              </w:rPr>
+              <w:t>Give this</w:t>
+            </w:r>
+          </w:p>
+        </w:tc>
+        <w:tc>
+          <w:tcPr>
+            <w:tcW w:type="dxa" w:w="4320"/>
+          </w:tcPr>
+          <w:p>
+            <w:r/>
+            <w:r>
+              <w:rPr>
+                <w:rFonts w:ascii="Calibri" w:hAnsi="Calibri" w:eastAsia="Calibri"/>
+                <w:b/>
+                <w:i w:val="0"/>
+                <w:sz w:val="20"/>
+              </w:rPr>
+              <w:t>To whom</w:t>
+            </w:r>
+          </w:p>
+        </w:tc>
+      </w:tr>
+      <w:tr>
+        <w:tc>
+          <w:tcPr>
+            <w:tcW w:type="dxa" w:w="4320"/>
+          </w:tcPr>
+          <w:p>
+            <w:r/>
+            <w:r>
+              <w:rPr>
+                <w:rFonts w:ascii="Calibri" w:hAnsi="Calibri" w:eastAsia="Calibri"/>
+                <w:b w:val="0"/>
+                <w:i w:val="0"/>
+                <w:sz w:val="20"/>
+              </w:rPr>
+              <w:t>This Word (or the markdown sibling)</w:t>
+            </w:r>
+          </w:p>
+        </w:tc>
+        <w:tc>
+          <w:tcPr>
+            <w:tcW w:type="dxa" w:w="4320"/>
+          </w:tcPr>
+          <w:p>
+            <w:r/>
+            <w:r>
+              <w:rPr>
+                <w:rFonts w:ascii="Calibri" w:hAnsi="Calibri" w:eastAsia="Calibri"/>
+                <w:b w:val="0"/>
+                <w:i w:val="0"/>
+                <w:sz w:val="20"/>
+              </w:rPr>
+              <w:t>Fayçal — proofs and walkthrough</w:t>
+            </w:r>
+          </w:p>
+        </w:tc>
+      </w:tr>
+      <w:tr>
+        <w:tc>
+          <w:tcPr>
+            <w:tcW w:type="dxa" w:w="4320"/>
+          </w:tcPr>
+          <w:p>
+            <w:r/>
+            <w:r>
+              <w:rPr>
+                <w:rFonts w:ascii="Calibri" w:hAnsi="Calibri" w:eastAsia="Calibri"/>
+                <w:b w:val="0"/>
+                <w:i w:val="0"/>
+                <w:sz w:val="20"/>
+              </w:rPr>
+              <w:t>nawa-pr-to-po-live-demo-presenter-fr.md</w:t>
+            </w:r>
+          </w:p>
+        </w:tc>
+        <w:tc>
+          <w:tcPr>
+            <w:tcW w:type="dxa" w:w="4320"/>
+          </w:tcPr>
+          <w:p>
+            <w:r/>
+            <w:r>
+              <w:rPr>
+                <w:rFonts w:ascii="Calibri" w:hAnsi="Calibri" w:eastAsia="Calibri"/>
+                <w:b w:val="0"/>
+                <w:i w:val="0"/>
+                <w:sz w:val="20"/>
+              </w:rPr>
+              <w:t>Presenter — one French page to hold during the talk</w:t>
+            </w:r>
+          </w:p>
+        </w:tc>
+      </w:tr>
+    </w:tbl>
+    <w:p/>
+    <w:p>
+      <w:pPr>
+        <w:pStyle w:val="Heading2"/>
+      </w:pPr>
+      <w:r>
+        <w:t>Open this URL</w:t>
       </w:r>
     </w:p>
     <w:p>
       <w:r>
         <w:rPr>
+          <w:rFonts w:ascii="Calibri" w:hAnsi="Calibri" w:eastAsia="Calibri"/>
+          <w:b/>
           <w:i w:val="0"/>
+          <w:sz w:val="22"/>
         </w:rPr>
-        <w:t>The bar is a clean, live SAP MCP integration. Walk the desk as an operator. These four proofs are in the work, not in a presenter strip.</w:t>
+        <w:t>https://agentium.papai.ai/work/pr-to-po?workspace=nawa&amp;lang=en</w:t>
       </w:r>
     </w:p>
     <w:p>
@@ -63,7 +206,13 @@
         <w:pStyle w:val="ListBullet"/>
       </w:pPr>
       <w:r>
-        <w:t>Live SAP data — KPIs and dossier facts come from get_A_PurchaseRequisitionItem, get_A_PurchaseRequisitionItem_by_key, fi_Validate, get_A_PurReqnAcctAssgmt, get_A_PurchaseOrderItem, get_A_PurchaseOrder.</w:t>
+        <w:rPr>
+          <w:rFonts w:ascii="Calibri" w:hAnsi="Calibri" w:eastAsia="Calibri"/>
+          <w:b w:val="0"/>
+          <w:i w:val="0"/>
+          <w:sz w:val="22"/>
+        </w:rPr>
+        <w:t>Hard-reload once (Ctrl+Shift+R / Cmd+Shift+R).</w:t>
       </w:r>
     </w:p>
     <w:p>
@@ -71,7 +220,13 @@
         <w:pStyle w:val="ListBullet"/>
       </w:pPr>
       <w:r>
-        <w:t>Small agentic task — the dossier summarises the justification read from SAP (azure_llm_v1). Invent nothing.</w:t>
+        <w:rPr>
+          <w:rFonts w:ascii="Calibri" w:hAnsi="Calibri" w:eastAsia="Calibri"/>
+          <w:b w:val="0"/>
+          <w:i w:val="0"/>
+          <w:sz w:val="22"/>
+        </w:rPr>
+        <w:t>Workspace nawa. Title on screen: PR to PO.</w:t>
       </w:r>
     </w:p>
     <w:p>
@@ -79,7 +234,13 @@
         <w:pStyle w:val="ListBullet"/>
       </w:pPr>
       <w:r>
-        <w:t>PO post request — the draft card is hikma post_A_PurchaseOrder, method POST, type NB, sealed, called: false. Composing the POST is the success. Do not send it.</w:t>
+        <w:rPr>
+          <w:rFonts w:ascii="Calibri" w:hAnsi="Calibri" w:eastAsia="Calibri"/>
+          <w:b w:val="0"/>
+          <w:i w:val="0"/>
+          <w:sz w:val="22"/>
+        </w:rPr>
+        <w:t>Presenter login: thibaud.ishacian@datategy.net.</w:t>
       </w:r>
     </w:p>
     <w:p>
@@ -87,7 +248,426 @@
         <w:pStyle w:val="ListBullet"/>
       </w:pPr>
       <w:r>
-        <w:t>Read-only questions — Ask the factory / Open the portal. Stay on get PR / get PO. Never claim a SAP write.</w:t>
+        <w:rPr>
+          <w:rFonts w:ascii="Calibri" w:hAnsi="Calibri" w:eastAsia="Calibri"/>
+          <w:b w:val="0"/>
+          <w:i w:val="0"/>
+          <w:sz w:val="22"/>
+        </w:rPr>
+        <w:t>Live Hikma MCP. No HANA. Write stays Sealed.</w:t>
+      </w:r>
+    </w:p>
+    <w:p>
+      <w:r>
+        <w:rPr>
+          <w:rFonts w:ascii="Calibri" w:hAnsi="Calibri" w:eastAsia="Calibri"/>
+          <w:b w:val="0"/>
+          <w:i/>
+          <w:sz w:val="22"/>
+        </w:rPr>
+        <w:t>Subtitle: System → Flow → Run → Decision. The factory reads Hikma, compiles a dossier, and writes nothing to SAP until you decide.</w:t>
+      </w:r>
+    </w:p>
+    <w:p>
+      <w:pPr>
+        <w:pStyle w:val="Heading2"/>
+      </w:pPr>
+      <w:r>
+        <w:t>What Fayçal must see (four proofs)</w:t>
+      </w:r>
+    </w:p>
+    <w:p>
+      <w:r>
+        <w:rPr>
+          <w:rFonts w:ascii="Calibri" w:hAnsi="Calibri" w:eastAsia="Calibri"/>
+          <w:b w:val="0"/>
+          <w:i w:val="0"/>
+          <w:sz w:val="22"/>
+        </w:rPr>
+        <w:t>The screen does not number these. You point at the matching card.</w:t>
+      </w:r>
+    </w:p>
+    <w:tbl>
+      <w:tblPr>
+        <w:tblStyle w:val="TableGrid"/>
+        <w:tblW w:type="auto" w:w="0"/>
+        <w:tblLook w:firstColumn="1" w:firstRow="1" w:lastColumn="0" w:lastRow="0" w:noHBand="0" w:noVBand="1" w:val="04A0"/>
+      </w:tblPr>
+      <w:tblGrid>
+        <w:gridCol w:w="2160"/>
+        <w:gridCol w:w="2160"/>
+        <w:gridCol w:w="2160"/>
+        <w:gridCol w:w="2160"/>
+      </w:tblGrid>
+      <w:tr>
+        <w:tc>
+          <w:tcPr>
+            <w:tcW w:type="dxa" w:w="2160"/>
+          </w:tcPr>
+          <w:p>
+            <w:r/>
+            <w:r>
+              <w:rPr>
+                <w:rFonts w:ascii="Calibri" w:hAnsi="Calibri" w:eastAsia="Calibri"/>
+                <w:b/>
+                <w:i w:val="0"/>
+                <w:sz w:val="20"/>
+              </w:rPr>
+              <w:t>#</w:t>
+            </w:r>
+          </w:p>
+        </w:tc>
+        <w:tc>
+          <w:tcPr>
+            <w:tcW w:type="dxa" w:w="2160"/>
+          </w:tcPr>
+          <w:p>
+            <w:r/>
+            <w:r>
+              <w:rPr>
+                <w:rFonts w:ascii="Calibri" w:hAnsi="Calibri" w:eastAsia="Calibri"/>
+                <w:b/>
+                <w:i w:val="0"/>
+                <w:sz w:val="20"/>
+              </w:rPr>
+              <w:t>Proof</w:t>
+            </w:r>
+          </w:p>
+        </w:tc>
+        <w:tc>
+          <w:tcPr>
+            <w:tcW w:type="dxa" w:w="2160"/>
+          </w:tcPr>
+          <w:p>
+            <w:r/>
+            <w:r>
+              <w:rPr>
+                <w:rFonts w:ascii="Calibri" w:hAnsi="Calibri" w:eastAsia="Calibri"/>
+                <w:b/>
+                <w:i w:val="0"/>
+                <w:sz w:val="20"/>
+              </w:rPr>
+              <w:t>Where you point</w:t>
+            </w:r>
+          </w:p>
+        </w:tc>
+        <w:tc>
+          <w:tcPr>
+            <w:tcW w:type="dxa" w:w="2160"/>
+          </w:tcPr>
+          <w:p>
+            <w:r/>
+            <w:r>
+              <w:rPr>
+                <w:rFonts w:ascii="Calibri" w:hAnsi="Calibri" w:eastAsia="Calibri"/>
+                <w:b/>
+                <w:i w:val="0"/>
+                <w:sz w:val="20"/>
+              </w:rPr>
+              <w:t>What must be true</w:t>
+            </w:r>
+          </w:p>
+        </w:tc>
+      </w:tr>
+      <w:tr>
+        <w:tc>
+          <w:tcPr>
+            <w:tcW w:type="dxa" w:w="2160"/>
+          </w:tcPr>
+          <w:p>
+            <w:r/>
+            <w:r>
+              <w:rPr>
+                <w:rFonts w:ascii="Calibri" w:hAnsi="Calibri" w:eastAsia="Calibri"/>
+                <w:b w:val="0"/>
+                <w:i w:val="0"/>
+                <w:sz w:val="20"/>
+              </w:rPr>
+              <w:t>1</w:t>
+            </w:r>
+          </w:p>
+        </w:tc>
+        <w:tc>
+          <w:tcPr>
+            <w:tcW w:type="dxa" w:w="2160"/>
+          </w:tcPr>
+          <w:p>
+            <w:r/>
+            <w:r>
+              <w:rPr>
+                <w:rFonts w:ascii="Calibri" w:hAnsi="Calibri" w:eastAsia="Calibri"/>
+                <w:b w:val="0"/>
+                <w:i w:val="0"/>
+                <w:sz w:val="20"/>
+              </w:rPr>
+              <w:t>Live SAP MCP</w:t>
+            </w:r>
+          </w:p>
+        </w:tc>
+        <w:tc>
+          <w:tcPr>
+            <w:tcW w:type="dxa" w:w="2160"/>
+          </w:tcPr>
+          <w:p>
+            <w:r/>
+            <w:r>
+              <w:rPr>
+                <w:rFonts w:ascii="Calibri" w:hAnsi="Calibri" w:eastAsia="Calibri"/>
+                <w:b w:val="0"/>
+                <w:i w:val="0"/>
+                <w:sz w:val="20"/>
+              </w:rPr>
+              <w:t>KPI row, stations, Read selected requisition, dossier facts</w:t>
+            </w:r>
+          </w:p>
+        </w:tc>
+        <w:tc>
+          <w:tcPr>
+            <w:tcW w:type="dxa" w:w="2160"/>
+          </w:tcPr>
+          <w:p>
+            <w:r/>
+            <w:r>
+              <w:rPr>
+                <w:rFonts w:ascii="Calibri" w:hAnsi="Calibri" w:eastAsia="Calibri"/>
+                <w:b w:val="0"/>
+                <w:i w:val="0"/>
+                <w:sz w:val="20"/>
+              </w:rPr>
+              <w:t>get_A_PurchaseRequisitionItem and _by_key return a real PR. listTaskCollection feeds the approval. fi_Validate / get_A_PurReqnAcctAssgmt feed budget. get_A_PurchaseOrder* feed orders, supplier, type. Compile shows python_recipe_v1.</w:t>
+            </w:r>
+          </w:p>
+        </w:tc>
+      </w:tr>
+      <w:tr>
+        <w:tc>
+          <w:tcPr>
+            <w:tcW w:type="dxa" w:w="2160"/>
+          </w:tcPr>
+          <w:p>
+            <w:r/>
+            <w:r>
+              <w:rPr>
+                <w:rFonts w:ascii="Calibri" w:hAnsi="Calibri" w:eastAsia="Calibri"/>
+                <w:b w:val="0"/>
+                <w:i w:val="0"/>
+                <w:sz w:val="20"/>
+              </w:rPr>
+              <w:t>2</w:t>
+            </w:r>
+          </w:p>
+        </w:tc>
+        <w:tc>
+          <w:tcPr>
+            <w:tcW w:type="dxa" w:w="2160"/>
+          </w:tcPr>
+          <w:p>
+            <w:r/>
+            <w:r>
+              <w:rPr>
+                <w:rFonts w:ascii="Calibri" w:hAnsi="Calibri" w:eastAsia="Calibri"/>
+                <w:b w:val="0"/>
+                <w:i w:val="0"/>
+                <w:sz w:val="20"/>
+              </w:rPr>
+              <w:t>Small agentic task</w:t>
+            </w:r>
+          </w:p>
+        </w:tc>
+        <w:tc>
+          <w:tcPr>
+            <w:tcW w:type="dxa" w:w="2160"/>
+          </w:tcPr>
+          <w:p>
+            <w:r/>
+            <w:r>
+              <w:rPr>
+                <w:rFonts w:ascii="Calibri" w:hAnsi="Calibri" w:eastAsia="Calibri"/>
+                <w:b w:val="0"/>
+                <w:i w:val="0"/>
+                <w:sz w:val="20"/>
+              </w:rPr>
+              <w:t>Summarise in the compiled dossier</w:t>
+            </w:r>
+          </w:p>
+        </w:tc>
+        <w:tc>
+          <w:tcPr>
+            <w:tcW w:type="dxa" w:w="2160"/>
+          </w:tcPr>
+          <w:p>
+            <w:r/>
+            <w:r>
+              <w:rPr>
+                <w:rFonts w:ascii="Calibri" w:hAnsi="Calibri" w:eastAsia="Calibri"/>
+                <w:b w:val="0"/>
+                <w:i w:val="0"/>
+                <w:sz w:val="20"/>
+              </w:rPr>
+              <w:t>azure_llm_v1 POST /chat/completion prompt_type: factual. Two clear sentences. Invent nothing.</w:t>
+            </w:r>
+          </w:p>
+        </w:tc>
+      </w:tr>
+      <w:tr>
+        <w:tc>
+          <w:tcPr>
+            <w:tcW w:type="dxa" w:w="2160"/>
+          </w:tcPr>
+          <w:p>
+            <w:r/>
+            <w:r>
+              <w:rPr>
+                <w:rFonts w:ascii="Calibri" w:hAnsi="Calibri" w:eastAsia="Calibri"/>
+                <w:b w:val="0"/>
+                <w:i w:val="0"/>
+                <w:sz w:val="20"/>
+              </w:rPr>
+              <w:t>3</w:t>
+            </w:r>
+          </w:p>
+        </w:tc>
+        <w:tc>
+          <w:tcPr>
+            <w:tcW w:type="dxa" w:w="2160"/>
+          </w:tcPr>
+          <w:p>
+            <w:r/>
+            <w:r>
+              <w:rPr>
+                <w:rFonts w:ascii="Calibri" w:hAnsi="Calibri" w:eastAsia="Calibri"/>
+                <w:b w:val="0"/>
+                <w:i w:val="0"/>
+                <w:sz w:val="20"/>
+              </w:rPr>
+              <w:t>PO POST package</w:t>
+            </w:r>
+          </w:p>
+        </w:tc>
+        <w:tc>
+          <w:tcPr>
+            <w:tcW w:type="dxa" w:w="2160"/>
+          </w:tcPr>
+          <w:p>
+            <w:r/>
+            <w:r>
+              <w:rPr>
+                <w:rFonts w:ascii="Calibri" w:hAnsi="Calibri" w:eastAsia="Calibri"/>
+                <w:b w:val="0"/>
+                <w:i w:val="0"/>
+                <w:sz w:val="20"/>
+              </w:rPr>
+              <w:t>Draft / Purchase order composed for SAP</w:t>
+            </w:r>
+          </w:p>
+        </w:tc>
+        <w:tc>
+          <w:tcPr>
+            <w:tcW w:type="dxa" w:w="2160"/>
+          </w:tcPr>
+          <w:p>
+            <w:r/>
+            <w:r>
+              <w:rPr>
+                <w:rFonts w:ascii="Calibri" w:hAnsi="Calibri" w:eastAsia="Calibri"/>
+                <w:b w:val="0"/>
+                <w:i w:val="0"/>
+                <w:sz w:val="20"/>
+              </w:rPr>
+              <w:t>hikma post_A_PurchaseOrder, type NB, Send Sealed. JSON sealed: true, called: false. Client 300 has no NB range; ZAPO is refused. Success = composed POST, not a live create.</w:t>
+            </w:r>
+          </w:p>
+        </w:tc>
+      </w:tr>
+      <w:tr>
+        <w:tc>
+          <w:tcPr>
+            <w:tcW w:type="dxa" w:w="2160"/>
+          </w:tcPr>
+          <w:p>
+            <w:r/>
+            <w:r>
+              <w:rPr>
+                <w:rFonts w:ascii="Calibri" w:hAnsi="Calibri" w:eastAsia="Calibri"/>
+                <w:b w:val="0"/>
+                <w:i w:val="0"/>
+                <w:sz w:val="20"/>
+              </w:rPr>
+              <w:t>4</w:t>
+            </w:r>
+          </w:p>
+        </w:tc>
+        <w:tc>
+          <w:tcPr>
+            <w:tcW w:type="dxa" w:w="2160"/>
+          </w:tcPr>
+          <w:p>
+            <w:r/>
+            <w:r>
+              <w:rPr>
+                <w:rFonts w:ascii="Calibri" w:hAnsi="Calibri" w:eastAsia="Calibri"/>
+                <w:b w:val="0"/>
+                <w:i w:val="0"/>
+                <w:sz w:val="20"/>
+              </w:rPr>
+              <w:t>Nice-to-have</w:t>
+            </w:r>
+          </w:p>
+        </w:tc>
+        <w:tc>
+          <w:tcPr>
+            <w:tcW w:type="dxa" w:w="2160"/>
+          </w:tcPr>
+          <w:p>
+            <w:r/>
+            <w:r>
+              <w:rPr>
+                <w:rFonts w:ascii="Calibri" w:hAnsi="Calibri" w:eastAsia="Calibri"/>
+                <w:b w:val="0"/>
+                <w:i w:val="0"/>
+                <w:sz w:val="20"/>
+              </w:rPr>
+              <w:t>Ask the factory / Open the portal</w:t>
+            </w:r>
+          </w:p>
+        </w:tc>
+        <w:tc>
+          <w:tcPr>
+            <w:tcW w:type="dxa" w:w="2160"/>
+          </w:tcPr>
+          <w:p>
+            <w:r/>
+            <w:r>
+              <w:rPr>
+                <w:rFonts w:ascii="Calibri" w:hAnsi="Calibri" w:eastAsia="Calibri"/>
+                <w:b w:val="0"/>
+                <w:i w:val="0"/>
+                <w:sz w:val="20"/>
+              </w:rPr>
+              <w:t>Read-only. Chips: Majority supplier, Orders read, Next step, Write status. The write stays sealed.</w:t>
+            </w:r>
+          </w:p>
+        </w:tc>
+      </w:tr>
+    </w:tbl>
+    <w:p/>
+    <w:p>
+      <w:r>
+        <w:rPr>
+          <w:rFonts w:ascii="Calibri" w:hAnsi="Calibri" w:eastAsia="Calibri"/>
+          <w:b/>
+          <w:i w:val="0"/>
+          <w:sz w:val="22"/>
+        </w:rPr>
+        <w:t>If the Write station says Sealed, that is correct.</w:t>
+      </w:r>
+    </w:p>
+    <w:p>
+      <w:pPr>
+        <w:pStyle w:val="Heading2"/>
+      </w:pPr>
+      <w:r>
+        <w:t>Walkthrough (about three minutes)</w:t>
       </w:r>
     </w:p>
     <w:p>
@@ -95,7 +675,13 @@
         <w:pStyle w:val="ListBullet"/>
       </w:pPr>
       <w:r>
-        <w:t>Honesty line: SAP client 300 has no NB number range; ZAPO is refused by the API. We do not fire a live create.</w:t>
+        <w:rPr>
+          <w:rFonts w:ascii="Calibri" w:hAnsi="Calibri" w:eastAsia="Calibri"/>
+          <w:b w:val="0"/>
+          <w:i w:val="0"/>
+          <w:sz w:val="22"/>
+        </w:rPr>
+        <w:t>Hard-reload. Header reads PR to PO. Four counts. Five stations. Write = Sealed.</w:t>
       </w:r>
     </w:p>
     <w:p>
@@ -103,7 +689,91 @@
         <w:pStyle w:val="ListBullet"/>
       </w:pPr>
       <w:r>
-        <w:t>Write stays Sealed for the whole talk. No tools/call on post_A_PurchaseOrder. No HANA. No invented YY1_* / A_* aliases.</w:t>
+        <w:rPr>
+          <w:rFonts w:ascii="Calibri" w:hAnsi="Calibri" w:eastAsia="Calibri"/>
+          <w:b w:val="0"/>
+          <w:i w:val="0"/>
+          <w:sz w:val="22"/>
+        </w:rPr>
+        <w:t>Click Run the factory. Wait until Compile is Done and the hero reads something like “Dossier compiled on STICKER WHITE — majority supplier 1000001737.”</w:t>
+      </w:r>
+    </w:p>
+    <w:p>
+      <w:pPr>
+        <w:pStyle w:val="ListBullet"/>
+      </w:pPr>
+      <w:r>
+        <w:rPr>
+          <w:rFonts w:ascii="Calibri" w:hAnsi="Calibri" w:eastAsia="Calibri"/>
+          <w:b w:val="0"/>
+          <w:i w:val="0"/>
+          <w:sz w:val="22"/>
+        </w:rPr>
+        <w:t>Proof 1 — Point at the counts and the tools under the stations. Click Read selected requisition if justification is empty.</w:t>
+      </w:r>
+    </w:p>
+    <w:p>
+      <w:pPr>
+        <w:pStyle w:val="ListBullet"/>
+      </w:pPr>
+      <w:r>
+        <w:rPr>
+          <w:rFonts w:ascii="Calibri" w:hAnsi="Calibri" w:eastAsia="Calibri"/>
+          <w:b w:val="0"/>
+          <w:i w:val="0"/>
+          <w:sz w:val="22"/>
+        </w:rPr>
+        <w:t>Proof 2 — Click Summarise. Two sentences appear via azure_llm_v1.</w:t>
+      </w:r>
+    </w:p>
+    <w:p>
+      <w:pPr>
+        <w:pStyle w:val="ListBullet"/>
+      </w:pPr>
+      <w:r>
+        <w:rPr>
+          <w:rFonts w:ascii="Calibri" w:hAnsi="Calibri" w:eastAsia="Calibri"/>
+          <w:b w:val="0"/>
+          <w:i w:val="0"/>
+          <w:sz w:val="22"/>
+        </w:rPr>
+        <w:t>Proof 3 — Scroll to Draft / Purchase order composed for SAP. Row: POST · hikma · post_A_PurchaseOrder · Send Sealed. Say: this is the POST we would send; it is not sent.</w:t>
+      </w:r>
+    </w:p>
+    <w:p>
+      <w:pPr>
+        <w:pStyle w:val="ListBullet"/>
+      </w:pPr>
+      <w:r>
+        <w:rPr>
+          <w:rFonts w:ascii="Calibri" w:hAnsi="Calibri" w:eastAsia="Calibri"/>
+          <w:b w:val="0"/>
+          <w:i w:val="0"/>
+          <w:sz w:val="22"/>
+        </w:rPr>
+        <w:t>Proof 4 — Chip Write status. Answer: the write stays sealed.</w:t>
+      </w:r>
+    </w:p>
+    <w:p>
+      <w:r>
+        <w:rPr>
+          <w:rFonts w:ascii="Calibri" w:hAnsi="Calibri" w:eastAsia="Calibri"/>
+          <w:b w:val="0"/>
+          <w:i w:val="0"/>
+          <w:sz w:val="22"/>
+        </w:rPr>
+        <w:t>There is no button that posts a purchase order.</w:t>
+      </w:r>
+    </w:p>
+    <w:p>
+      <w:r>
+        <w:rPr>
+          <w:rFonts w:ascii="Calibri" w:hAnsi="Calibri" w:eastAsia="Calibri"/>
+          <w:b w:val="0"/>
+          <w:i/>
+          <w:sz w:val="22"/>
+        </w:rPr>
+        <w:t>Talk track: “This is the PR to PO factory. It reads Hikma through MCP, compiles a dossier, and writes nothing until a human decides.”</w:t>
       </w:r>
     </w:p>
     <w:p>
@@ -111,63 +781,26 @@
         <w:pStyle w:val="Heading2"/>
       </w:pPr>
       <w:r>
-        <w:t>Before you start</w:t>
+        <w:t>Screen map</w:t>
       </w:r>
     </w:p>
     <w:p>
       <w:pPr>
-        <w:pStyle w:val="ListBullet"/>
+        <w:pStyle w:val="Heading3"/>
       </w:pPr>
       <w:r>
-        <w:t>Browser: Chrome or Edge. English. Workspace nawa.</w:t>
-      </w:r>
-    </w:p>
-    <w:p>
-      <w:pPr>
-        <w:pStyle w:val="ListBullet"/>
-      </w:pPr>
-      <w:r>
-        <w:t>Hard-reload once (Ctrl+Shift+R / Cmd+Shift+R) so you are not on a stale tab.</w:t>
-      </w:r>
-    </w:p>
-    <w:p>
-      <w:pPr>
-        <w:pStyle w:val="ListBullet"/>
-      </w:pPr>
-      <w:r>
-        <w:t>Sign in with the operator account that already belongs to nawa. Open My applications → PR to PO, or paste the URL above.</w:t>
-      </w:r>
-    </w:p>
-    <w:p>
-      <w:pPr>
-        <w:pStyle w:val="ListBullet"/>
-      </w:pPr>
-      <w:r>
-        <w:t>Optional: Connections if someone asks where SAP / Hikma live. One CONNECTORS card, mcp. Do not open HANA.</w:t>
-      </w:r>
-    </w:p>
-    <w:p>
-      <w:pPr>
-        <w:pStyle w:val="ListBullet"/>
-      </w:pPr>
-      <w:r>
-        <w:t>There is no button that creates a PO in SAP.</w:t>
-      </w:r>
-    </w:p>
-    <w:p>
-      <w:pPr>
-        <w:pStyle w:val="Heading2"/>
-      </w:pPr>
-      <w:r>
-        <w:t>Step 1 — Open the desk</w:t>
+        <w:t>Top of the desk</w:t>
       </w:r>
     </w:p>
     <w:p>
       <w:r>
         <w:rPr>
+          <w:rFonts w:ascii="Calibri" w:hAnsi="Calibri" w:eastAsia="Calibri"/>
+          <w:b w:val="0"/>
           <w:i w:val="0"/>
+          <w:sz w:val="22"/>
         </w:rPr>
-        <w:t>You land on the NAWA factory desk: lineage, a short briefing, counts, and the station line. No numbered demo tiles.</w:t>
+        <w:t>Lineage, briefing, counts, stations, compiled dossier. Actions in the dossier header: Read selected requisition, Summarise.</w:t>
       </w:r>
     </w:p>
     <w:p>
@@ -183,7 +816,7 @@
               <a:graphicData uri="http://schemas.openxmlformats.org/drawingml/2006/picture">
                 <pic:pic>
                   <pic:nvPicPr>
-                    <pic:cNvPr id="0" name="live5_desk_top.png"/>
+                    <pic:cNvPr id="0" name="desk-top.png"/>
                     <pic:cNvPicPr/>
                   </pic:nvPicPr>
                   <pic:blipFill>
@@ -212,6 +845,8 @@
       </w:pPr>
       <w:r>
         <w:rPr>
+          <w:rFonts w:ascii="Calibri" w:hAnsi="Calibri" w:eastAsia="Calibri"/>
+          <w:b w:val="0"/>
           <w:i/>
           <w:color w:val="555555"/>
           <w:sz w:val="18"/>
@@ -220,27 +855,22 @@
       </w:r>
     </w:p>
     <w:p>
-      <w:r>
-        <w:rPr>
-          <w:i w:val="0"/>
-        </w:rPr>
-        <w:t>Talk track: “This is the PR to PO factory. It reads Hikma through MCP, compiles a dossier, and writes nothing until a human decides.”</w:t>
-      </w:r>
-    </w:p>
-    <w:p>
       <w:pPr>
-        <w:pStyle w:val="Heading2"/>
+        <w:pStyle w:val="Heading3"/>
       </w:pPr>
       <w:r>
-        <w:t>Step 2 — Live SAP data</w:t>
+        <w:t>Compiled dossier (proofs 1 and 2)</w:t>
       </w:r>
     </w:p>
     <w:p>
       <w:r>
         <w:rPr>
+          <w:rFonts w:ascii="Calibri" w:hAnsi="Calibri" w:eastAsia="Calibri"/>
+          <w:b w:val="0"/>
           <w:i w:val="0"/>
+          <w:sz w:val="22"/>
         </w:rPr>
-        <w:t>Click Run the factory if the counts are still empty. Wait until Requisitions / Tasks / Orders fill in.</w:t>
+        <w:t>Facts name their tools. Justification via get_A_PurchaseRequisitionItem_by_key. Summary via azure_llm_v1.</w:t>
       </w:r>
     </w:p>
     <w:p>
@@ -256,7 +886,7 @@
               <a:graphicData uri="http://schemas.openxmlformats.org/drawingml/2006/picture">
                 <pic:pic>
                   <pic:nvPicPr>
-                    <pic:cNvPr id="0" name="live5_dossier.png"/>
+                    <pic:cNvPr id="0" name="dossier.png"/>
                     <pic:cNvPicPr/>
                   </pic:nvPicPr>
                   <pic:blipFill>
@@ -285,6 +915,8 @@
       </w:pPr>
       <w:r>
         <w:rPr>
+          <w:rFonts w:ascii="Calibri" w:hAnsi="Calibri" w:eastAsia="Calibri"/>
+          <w:b w:val="0"/>
           <w:i/>
           <w:color w:val="555555"/>
           <w:sz w:val="18"/>
@@ -294,10 +926,10 @@
     </w:p>
     <w:p>
       <w:pPr>
-        <w:pStyle w:val="ListBullet"/>
+        <w:pStyle w:val="Heading3"/>
       </w:pPr>
       <w:r>
-        <w:t>Point at the counts. Those are live MCP reads, not a fixture.</w:t>
+        <w:t>Draft purchase order (proof 3)</w:t>
       </w:r>
     </w:p>
     <w:p>
@@ -305,7 +937,13 @@
         <w:pStyle w:val="ListBullet"/>
       </w:pPr>
       <w:r>
-        <w:t>In the dossier, the selected requisition is via get_A_PurchaseRequisitionItem. Supplier and order type via get_A_PurchaseOrder.</w:t>
+        <w:rPr>
+          <w:rFonts w:ascii="Calibri" w:hAnsi="Calibri" w:eastAsia="Calibri"/>
+          <w:b w:val="0"/>
+          <w:i w:val="0"/>
+          <w:sz w:val="22"/>
+        </w:rPr>
+        <w:t>Kicker Draft. Title Purchase order composed for SAP.</w:t>
       </w:r>
     </w:p>
     <w:p>
@@ -313,31 +951,41 @@
         <w:pStyle w:val="ListBullet"/>
       </w:pPr>
       <w:r>
-        <w:t>Stations: Connect Done · Read Done · Compile Done · Decide Ready · Write Sealed.</w:t>
-      </w:r>
-    </w:p>
-    <w:p>
-      <w:r>
         <w:rPr>
+          <w:rFonts w:ascii="Calibri" w:hAnsi="Calibri" w:eastAsia="Calibri"/>
+          <w:b w:val="0"/>
           <w:i w:val="0"/>
+          <w:sz w:val="22"/>
         </w:rPr>
-        <w:t>If someone asks “is this HANA?”: no. HANA is off. The servers are sap, hikma, sap_inbox, sap_gr.</w:t>
+        <w:t>Hint: Draft purchase order. It is not sent; the write stays sealed.</w:t>
       </w:r>
     </w:p>
     <w:p>
       <w:pPr>
-        <w:pStyle w:val="Heading2"/>
+        <w:pStyle w:val="ListBullet"/>
       </w:pPr>
       <w:r>
-        <w:t>Step 3 — Justification summary</w:t>
+        <w:rPr>
+          <w:rFonts w:ascii="Calibri" w:hAnsi="Calibri" w:eastAsia="Calibri"/>
+          <w:b w:val="0"/>
+          <w:i w:val="0"/>
+          <w:sz w:val="22"/>
+        </w:rPr>
+        <w:t>Row: Method POST · Server hikma · Tool post_A_PurchaseOrder · Send Sealed.</w:t>
       </w:r>
     </w:p>
     <w:p>
+      <w:pPr>
+        <w:pStyle w:val="ListBullet"/>
+      </w:pPr>
       <w:r>
         <w:rPr>
+          <w:rFonts w:ascii="Calibri" w:hAnsi="Calibri" w:eastAsia="Calibri"/>
+          <w:b w:val="0"/>
           <w:i w:val="0"/>
+          <w:sz w:val="22"/>
         </w:rPr>
-        <w:t>Scroll to Compiled dossier. If justification is empty, click Read selected requisition, then Summarise. The desk also summarises on its own after the first read.</w:t>
+        <w:t>Footnote: Client 300 has no NB number range. The API refuses ZAPO.</w:t>
       </w:r>
     </w:p>
     <w:p>
@@ -353,96 +1001,7 @@
               <a:graphicData uri="http://schemas.openxmlformats.org/drawingml/2006/picture">
                 <pic:pic>
                   <pic:nvPicPr>
-                    <pic:cNvPr id="0" name="live5_dossier.png"/>
-                    <pic:cNvPicPr/>
-                  </pic:nvPicPr>
-                  <pic:blipFill>
-                    <a:blip r:embed="rId10"/>
-                    <a:stretch>
-                      <a:fillRect/>
-                    </a:stretch>
-                  </pic:blipFill>
-                  <pic:spPr>
-                    <a:xfrm>
-                      <a:off x="0" y="0"/>
-                      <a:ext cx="5852160" cy="4470400"/>
-                    </a:xfrm>
-                    <a:prstGeom prst="rect"/>
-                  </pic:spPr>
-                </pic:pic>
-              </a:graphicData>
-            </a:graphic>
-          </wp:inline>
-        </w:drawing>
-      </w:r>
-    </w:p>
-    <w:p>
-      <w:pPr>
-        <w:jc w:val="center"/>
-      </w:pPr>
-      <w:r>
-        <w:rPr>
-          <w:i/>
-          <w:color w:val="555555"/>
-          <w:sz w:val="18"/>
-        </w:rPr>
-        <w:t>Figure 3 — Justification from SAP and the short model summary.</w:t>
-      </w:r>
-    </w:p>
-    <w:p>
-      <w:pPr>
-        <w:pStyle w:val="ListBullet"/>
-      </w:pPr>
-      <w:r>
-        <w:t>Show Justification (via get_A_PurchaseRequisitionItem_by_key) and Justification summary (via azure_llm_v1).</w:t>
-      </w:r>
-    </w:p>
-    <w:p>
-      <w:pPr>
-        <w:pStyle w:val="ListBullet"/>
-      </w:pPr>
-      <w:r>
-        <w:t>Talk track: “One short model call. Two sentences. Nothing invented. Nothing written to SAP.”</w:t>
-      </w:r>
-    </w:p>
-    <w:p>
-      <w:r>
-        <w:rPr>
-          <w:i w:val="0"/>
-        </w:rPr>
-        <w:t>Typical live example: STICKER WHITE. The exact PR can move; the tools must not.</w:t>
-      </w:r>
-    </w:p>
-    <w:p>
-      <w:pPr>
-        <w:pStyle w:val="Heading2"/>
-      </w:pPr>
-      <w:r>
-        <w:t>Step 4 — Draft purchase order (not sent)</w:t>
-      </w:r>
-    </w:p>
-    <w:p>
-      <w:r>
-        <w:rPr>
-          <w:i w:val="0"/>
-        </w:rPr>
-        <w:t>Scroll to Purchase order composed for SAP.</w:t>
-      </w:r>
-    </w:p>
-    <w:p>
-      <w:r>
-        <w:drawing>
-          <wp:inline xmlns:a="http://schemas.openxmlformats.org/drawingml/2006/main" xmlns:pic="http://schemas.openxmlformats.org/drawingml/2006/picture">
-            <wp:extent cx="5852160" cy="4470400"/>
-            <wp:docPr id="4" name="Picture 4"/>
-            <wp:cNvGraphicFramePr>
-              <a:graphicFrameLocks noChangeAspect="1"/>
-            </wp:cNvGraphicFramePr>
-            <a:graphic>
-              <a:graphicData uri="http://schemas.openxmlformats.org/drawingml/2006/picture">
-                <pic:pic>
-                  <pic:nvPicPr>
-                    <pic:cNvPr id="0" name="live5_post.png"/>
+                    <pic:cNvPr id="0" name="post.png"/>
                     <pic:cNvPicPr/>
                   </pic:nvPicPr>
                   <pic:blipFill>
@@ -471,75 +1030,32 @@
       </w:pPr>
       <w:r>
         <w:rPr>
+          <w:rFonts w:ascii="Calibri" w:hAnsi="Calibri" w:eastAsia="Calibri"/>
+          <w:b w:val="0"/>
           <w:i/>
           <w:color w:val="555555"/>
           <w:sz w:val="18"/>
         </w:rPr>
-        <w:t>Figure 4 — Draft hikma POST: type NB, sealed, not sent.</w:t>
+        <w:t>Figure 3 — Draft hikma POST: type NB, sealed, not sent.</w:t>
       </w:r>
     </w:p>
     <w:p>
       <w:pPr>
-        <w:pStyle w:val="ListBullet"/>
+        <w:pStyle w:val="Heading3"/>
       </w:pPr>
       <w:r>
-        <w:t>Read the header: POST · hikma · post_A_PurchaseOrder · Sealed.</w:t>
-      </w:r>
-    </w:p>
-    <w:p>
-      <w:pPr>
-        <w:pStyle w:val="ListBullet"/>
-      </w:pPr>
-      <w:r>
-        <w:t>In the JSON: sealed true, called false, PurchaseOrderType NB, supplier from the live majority, item linked to the selected PR.</w:t>
-      </w:r>
-    </w:p>
-    <w:p>
-      <w:pPr>
-        <w:pStyle w:val="ListBullet"/>
-      </w:pPr>
-      <w:r>
-        <w:t>Footnote: Client 300 has no NB number range. The API refuses ZAPO.</w:t>
+        <w:t>Ask the factory (proof 4)</w:t>
       </w:r>
     </w:p>
     <w:p>
       <w:r>
         <w:rPr>
+          <w:rFonts w:ascii="Calibri" w:hAnsi="Calibri" w:eastAsia="Calibri"/>
+          <w:b w:val="0"/>
           <w:i w:val="0"/>
+          <w:sz w:val="22"/>
         </w:rPr>
-        <w:t>If someone asks to “just post it”: refuse. The write stays sealed.</w:t>
-      </w:r>
-    </w:p>
-    <w:p>
-      <w:pPr>
-        <w:pStyle w:val="Heading2"/>
-      </w:pPr>
-      <w:r>
-        <w:t>Step 5 — Questions</w:t>
-      </w:r>
-    </w:p>
-    <w:p>
-      <w:r>
-        <w:rPr>
-          <w:i w:val="0"/>
-        </w:rPr>
-        <w:t>Two ways, both valid:</w:t>
-      </w:r>
-    </w:p>
-    <w:p>
-      <w:pPr>
-        <w:pStyle w:val="ListBullet"/>
-      </w:pPr>
-      <w:r>
-        <w:t>Fast: chips under Ask the factory — Majority supplier, Orders read, Next step, Write status. Write status must answer No; the write stays sealed.</w:t>
-      </w:r>
-    </w:p>
-    <w:p>
-      <w:pPr>
-        <w:pStyle w:val="ListBullet"/>
-      </w:pPr>
-      <w:r>
-        <w:t>Conversational: Open the portal. Ask how many requisitions/orders were just read, or who the majority supplier is.</w:t>
+        <w:t>Hint: Questions about the live reads. The write stays sealed.</w:t>
       </w:r>
     </w:p>
     <w:p>
@@ -547,7 +1063,7 @@
         <w:drawing>
           <wp:inline xmlns:a="http://schemas.openxmlformats.org/drawingml/2006/main" xmlns:pic="http://schemas.openxmlformats.org/drawingml/2006/picture">
             <wp:extent cx="5852160" cy="4470400"/>
-            <wp:docPr id="5" name="Picture 5"/>
+            <wp:docPr id="4" name="Picture 4"/>
             <wp:cNvGraphicFramePr>
               <a:graphicFrameLocks noChangeAspect="1"/>
             </wp:cNvGraphicFramePr>
@@ -555,7 +1071,7 @@
               <a:graphicData uri="http://schemas.openxmlformats.org/drawingml/2006/picture">
                 <pic:pic>
                   <pic:nvPicPr>
-                    <pic:cNvPr id="0" name="live5_ask.png"/>
+                    <pic:cNvPr id="0" name="ask.png"/>
                     <pic:cNvPicPr/>
                   </pic:nvPicPr>
                   <pic:blipFill>
@@ -584,11 +1100,32 @@
       </w:pPr>
       <w:r>
         <w:rPr>
+          <w:rFonts w:ascii="Calibri" w:hAnsi="Calibri" w:eastAsia="Calibri"/>
+          <w:b w:val="0"/>
           <w:i/>
           <w:color w:val="555555"/>
           <w:sz w:val="18"/>
         </w:rPr>
-        <w:t>Figure 5 — Write status stays no; write sealed.</w:t>
+        <w:t>Figure 4 — Write status answers No; the write station stays sealed.</w:t>
+      </w:r>
+    </w:p>
+    <w:p>
+      <w:pPr>
+        <w:pStyle w:val="Heading3"/>
+      </w:pPr>
+      <w:r>
+        <w:t>Portal</w:t>
+      </w:r>
+    </w:p>
+    <w:p>
+      <w:r>
+        <w:rPr>
+          <w:rFonts w:ascii="Calibri" w:hAnsi="Calibri" w:eastAsia="Calibri"/>
+          <w:b w:val="0"/>
+          <w:i w:val="0"/>
+          <w:sz w:val="22"/>
+        </w:rPr>
+        <w:t>Hint: Answers from the requisitions and orders just read. The write stays sealed. Stay on get-PR / get-PO questions. Older summarise prompts in the portal thread are session history, not a second write.</w:t>
       </w:r>
     </w:p>
     <w:p>
@@ -596,7 +1133,7 @@
         <w:drawing>
           <wp:inline xmlns:a="http://schemas.openxmlformats.org/drawingml/2006/main" xmlns:pic="http://schemas.openxmlformats.org/drawingml/2006/picture">
             <wp:extent cx="5852160" cy="4470400"/>
-            <wp:docPr id="6" name="Picture 6"/>
+            <wp:docPr id="5" name="Picture 5"/>
             <wp:cNvGraphicFramePr>
               <a:graphicFrameLocks noChangeAspect="1"/>
             </wp:cNvGraphicFramePr>
@@ -604,7 +1141,7 @@
               <a:graphicData uri="http://schemas.openxmlformats.org/drawingml/2006/picture">
                 <pic:pic>
                   <pic:nvPicPr>
-                    <pic:cNvPr id="0" name="live5_portal.png"/>
+                    <pic:cNvPr id="0" name="portal.png"/>
                     <pic:cNvPicPr/>
                   </pic:nvPicPr>
                   <pic:blipFill>
@@ -633,19 +1170,13 @@
       </w:pPr>
       <w:r>
         <w:rPr>
+          <w:rFonts w:ascii="Calibri" w:hAnsi="Calibri" w:eastAsia="Calibri"/>
+          <w:b w:val="0"/>
           <w:i/>
           <w:color w:val="555555"/>
           <w:sz w:val="18"/>
         </w:rPr>
-        <w:t>Figure 6 — Portal on the live reads. Write stays sealed.</w:t>
-      </w:r>
-    </w:p>
-    <w:p>
-      <w:r>
-        <w:rPr>
-          <w:i w:val="0"/>
-        </w:rPr>
-        <w:t>Do not let the portal call post_A_PurchaseOrder, fi_DiscardFromPurchasing, or fi_EnableForPurchasing.</w:t>
+        <w:t>Figure 5 — Factory portal on the live reads. Write stays sealed.</w:t>
       </w:r>
     </w:p>
     <w:p>
@@ -653,31 +1184,828 @@
         <w:pStyle w:val="Heading2"/>
       </w:pPr>
       <w:r>
-        <w:t>Optional extras (only if there is time)</w:t>
+        <w:t>Live example (31 August 2026, SHA cd40fe33)</w:t>
+      </w:r>
+    </w:p>
+    <w:tbl>
+      <w:tblPr>
+        <w:tblStyle w:val="TableGrid"/>
+        <w:tblW w:type="auto" w:w="0"/>
+        <w:tblLook w:firstColumn="1" w:firstRow="1" w:lastColumn="0" w:lastRow="0" w:noHBand="0" w:noVBand="1" w:val="04A0"/>
+      </w:tblPr>
+      <w:tblGrid>
+        <w:gridCol w:w="4320"/>
+        <w:gridCol w:w="4320"/>
+      </w:tblGrid>
+      <w:tr>
+        <w:tc>
+          <w:tcPr>
+            <w:tcW w:type="dxa" w:w="4320"/>
+          </w:tcPr>
+          <w:p>
+            <w:r/>
+            <w:r>
+              <w:rPr>
+                <w:rFonts w:ascii="Calibri" w:hAnsi="Calibri" w:eastAsia="Calibri"/>
+                <w:b/>
+                <w:i w:val="0"/>
+                <w:sz w:val="20"/>
+              </w:rPr>
+              <w:t>Field</w:t>
+            </w:r>
+          </w:p>
+        </w:tc>
+        <w:tc>
+          <w:tcPr>
+            <w:tcW w:type="dxa" w:w="4320"/>
+          </w:tcPr>
+          <w:p>
+            <w:r/>
+            <w:r>
+              <w:rPr>
+                <w:rFonts w:ascii="Calibri" w:hAnsi="Calibri" w:eastAsia="Calibri"/>
+                <w:b/>
+                <w:i w:val="0"/>
+                <w:sz w:val="20"/>
+              </w:rPr>
+              <w:t>Value</w:t>
+            </w:r>
+          </w:p>
+        </w:tc>
+      </w:tr>
+      <w:tr>
+        <w:tc>
+          <w:tcPr>
+            <w:tcW w:type="dxa" w:w="4320"/>
+          </w:tcPr>
+          <w:p>
+            <w:r/>
+            <w:r>
+              <w:rPr>
+                <w:rFonts w:ascii="Calibri" w:hAnsi="Calibri" w:eastAsia="Calibri"/>
+                <w:b w:val="0"/>
+                <w:i w:val="0"/>
+                <w:sz w:val="20"/>
+              </w:rPr>
+              <w:t>Headline</w:t>
+            </w:r>
+          </w:p>
+        </w:tc>
+        <w:tc>
+          <w:tcPr>
+            <w:tcW w:type="dxa" w:w="4320"/>
+          </w:tcPr>
+          <w:p>
+            <w:r/>
+            <w:r>
+              <w:rPr>
+                <w:rFonts w:ascii="Calibri" w:hAnsi="Calibri" w:eastAsia="Calibri"/>
+                <w:b w:val="0"/>
+                <w:i w:val="0"/>
+                <w:sz w:val="20"/>
+              </w:rPr>
+              <w:t>Dossier compiled on STICKER WHITE — majority supplier 1000001737.</w:t>
+            </w:r>
+          </w:p>
+        </w:tc>
+      </w:tr>
+      <w:tr>
+        <w:tc>
+          <w:tcPr>
+            <w:tcW w:type="dxa" w:w="4320"/>
+          </w:tcPr>
+          <w:p>
+            <w:r/>
+            <w:r>
+              <w:rPr>
+                <w:rFonts w:ascii="Calibri" w:hAnsi="Calibri" w:eastAsia="Calibri"/>
+                <w:b w:val="0"/>
+                <w:i w:val="0"/>
+                <w:sz w:val="20"/>
+              </w:rPr>
+              <w:t>Counts</w:t>
+            </w:r>
+          </w:p>
+        </w:tc>
+        <w:tc>
+          <w:tcPr>
+            <w:tcW w:type="dxa" w:w="4320"/>
+          </w:tcPr>
+          <w:p>
+            <w:r/>
+            <w:r>
+              <w:rPr>
+                <w:rFonts w:ascii="Calibri" w:hAnsi="Calibri" w:eastAsia="Calibri"/>
+                <w:b w:val="0"/>
+                <w:i w:val="0"/>
+                <w:sz w:val="20"/>
+              </w:rPr>
+              <w:t>Requisitions 50 · Tasks 2 · Orders 5 · Receipts 0</w:t>
+            </w:r>
+          </w:p>
+        </w:tc>
+      </w:tr>
+      <w:tr>
+        <w:tc>
+          <w:tcPr>
+            <w:tcW w:type="dxa" w:w="4320"/>
+          </w:tcPr>
+          <w:p>
+            <w:r/>
+            <w:r>
+              <w:rPr>
+                <w:rFonts w:ascii="Calibri" w:hAnsi="Calibri" w:eastAsia="Calibri"/>
+                <w:b w:val="0"/>
+                <w:i w:val="0"/>
+                <w:sz w:val="20"/>
+              </w:rPr>
+              <w:t>Stations</w:t>
+            </w:r>
+          </w:p>
+        </w:tc>
+        <w:tc>
+          <w:tcPr>
+            <w:tcW w:type="dxa" w:w="4320"/>
+          </w:tcPr>
+          <w:p>
+            <w:r/>
+            <w:r>
+              <w:rPr>
+                <w:rFonts w:ascii="Calibri" w:hAnsi="Calibri" w:eastAsia="Calibri"/>
+                <w:b w:val="0"/>
+                <w:i w:val="0"/>
+                <w:sz w:val="20"/>
+              </w:rPr>
+              <w:t>Connect Done · Read Done (get_A_PurchaseRequisitionItem) · Compile Done (python_recipe_v1) · Decide Ready · Write Sealed</w:t>
+            </w:r>
+          </w:p>
+        </w:tc>
+      </w:tr>
+      <w:tr>
+        <w:tc>
+          <w:tcPr>
+            <w:tcW w:type="dxa" w:w="4320"/>
+          </w:tcPr>
+          <w:p>
+            <w:r/>
+            <w:r>
+              <w:rPr>
+                <w:rFonts w:ascii="Calibri" w:hAnsi="Calibri" w:eastAsia="Calibri"/>
+                <w:b w:val="0"/>
+                <w:i w:val="0"/>
+                <w:sz w:val="20"/>
+              </w:rPr>
+              <w:t>Selected requisition</w:t>
+            </w:r>
+          </w:p>
+        </w:tc>
+        <w:tc>
+          <w:tcPr>
+            <w:tcW w:type="dxa" w:w="4320"/>
+          </w:tcPr>
+          <w:p>
+            <w:r/>
+            <w:r>
+              <w:rPr>
+                <w:rFonts w:ascii="Calibri" w:hAnsi="Calibri" w:eastAsia="Calibri"/>
+                <w:b w:val="0"/>
+                <w:i w:val="0"/>
+                <w:sz w:val="20"/>
+              </w:rPr>
+              <w:t>STICKER WHITE via get_A_PurchaseRequisitionItem</w:t>
+            </w:r>
+          </w:p>
+        </w:tc>
+      </w:tr>
+      <w:tr>
+        <w:tc>
+          <w:tcPr>
+            <w:tcW w:type="dxa" w:w="4320"/>
+          </w:tcPr>
+          <w:p>
+            <w:r/>
+            <w:r>
+              <w:rPr>
+                <w:rFonts w:ascii="Calibri" w:hAnsi="Calibri" w:eastAsia="Calibri"/>
+                <w:b w:val="0"/>
+                <w:i w:val="0"/>
+                <w:sz w:val="20"/>
+              </w:rPr>
+              <w:t>Approval task</w:t>
+            </w:r>
+          </w:p>
+        </w:tc>
+        <w:tc>
+          <w:tcPr>
+            <w:tcW w:type="dxa" w:w="4320"/>
+          </w:tcPr>
+          <w:p>
+            <w:r/>
+            <w:r>
+              <w:rPr>
+                <w:rFonts w:ascii="Calibri" w:hAnsi="Calibri" w:eastAsia="Calibri"/>
+                <w:b w:val="0"/>
+                <w:i w:val="0"/>
+                <w:sz w:val="20"/>
+              </w:rPr>
+              <w:t>Release TR transaction 1000008 56B 200 via listTaskCollection</w:t>
+            </w:r>
+          </w:p>
+        </w:tc>
+      </w:tr>
+      <w:tr>
+        <w:tc>
+          <w:tcPr>
+            <w:tcW w:type="dxa" w:w="4320"/>
+          </w:tcPr>
+          <w:p>
+            <w:r/>
+            <w:r>
+              <w:rPr>
+                <w:rFonts w:ascii="Calibri" w:hAnsi="Calibri" w:eastAsia="Calibri"/>
+                <w:b w:val="0"/>
+                <w:i w:val="0"/>
+                <w:sz w:val="20"/>
+              </w:rPr>
+              <w:t>PR in the POST</w:t>
+            </w:r>
+          </w:p>
+        </w:tc>
+        <w:tc>
+          <w:tcPr>
+            <w:tcW w:type="dxa" w:w="4320"/>
+          </w:tcPr>
+          <w:p>
+            <w:r/>
+            <w:r>
+              <w:rPr>
+                <w:rFonts w:ascii="Calibri" w:hAnsi="Calibri" w:eastAsia="Calibri"/>
+                <w:b w:val="0"/>
+                <w:i w:val="0"/>
+                <w:sz w:val="20"/>
+              </w:rPr>
+              <w:t>2000276449 item 10</w:t>
+            </w:r>
+          </w:p>
+        </w:tc>
+      </w:tr>
+      <w:tr>
+        <w:tc>
+          <w:tcPr>
+            <w:tcW w:type="dxa" w:w="4320"/>
+          </w:tcPr>
+          <w:p>
+            <w:r/>
+            <w:r>
+              <w:rPr>
+                <w:rFonts w:ascii="Calibri" w:hAnsi="Calibri" w:eastAsia="Calibri"/>
+                <w:b w:val="0"/>
+                <w:i w:val="0"/>
+                <w:sz w:val="20"/>
+              </w:rPr>
+              <w:t>Justification</w:t>
+            </w:r>
+          </w:p>
+        </w:tc>
+        <w:tc>
+          <w:tcPr>
+            <w:tcW w:type="dxa" w:w="4320"/>
+          </w:tcPr>
+          <w:p>
+            <w:r/>
+            <w:r>
+              <w:rPr>
+                <w:rFonts w:ascii="Calibri" w:hAnsi="Calibri" w:eastAsia="Calibri"/>
+                <w:b w:val="0"/>
+                <w:i w:val="0"/>
+                <w:sz w:val="20"/>
+              </w:rPr>
+              <w:t>STICKER WHITE via get_A_PurchaseRequisitionItem_by_key</w:t>
+            </w:r>
+          </w:p>
+        </w:tc>
+      </w:tr>
+      <w:tr>
+        <w:tc>
+          <w:tcPr>
+            <w:tcW w:type="dxa" w:w="4320"/>
+          </w:tcPr>
+          <w:p>
+            <w:r/>
+            <w:r>
+              <w:rPr>
+                <w:rFonts w:ascii="Calibri" w:hAnsi="Calibri" w:eastAsia="Calibri"/>
+                <w:b w:val="0"/>
+                <w:i w:val="0"/>
+                <w:sz w:val="20"/>
+              </w:rPr>
+              <w:t>Summary</w:t>
+            </w:r>
+          </w:p>
+        </w:tc>
+        <w:tc>
+          <w:tcPr>
+            <w:tcW w:type="dxa" w:w="4320"/>
+          </w:tcPr>
+          <w:p>
+            <w:r/>
+            <w:r>
+              <w:rPr>
+                <w:rFonts w:ascii="Calibri" w:hAnsi="Calibri" w:eastAsia="Calibri"/>
+                <w:b w:val="0"/>
+                <w:i w:val="0"/>
+                <w:sz w:val="20"/>
+              </w:rPr>
+              <w:t>The purchase requisition is for white stickers. No additional justification details are provided in the text. via azure_llm_v1</w:t>
+            </w:r>
+          </w:p>
+        </w:tc>
+      </w:tr>
+      <w:tr>
+        <w:tc>
+          <w:tcPr>
+            <w:tcW w:type="dxa" w:w="4320"/>
+          </w:tcPr>
+          <w:p>
+            <w:r/>
+            <w:r>
+              <w:rPr>
+                <w:rFonts w:ascii="Calibri" w:hAnsi="Calibri" w:eastAsia="Calibri"/>
+                <w:b w:val="0"/>
+                <w:i w:val="0"/>
+                <w:sz w:val="20"/>
+              </w:rPr>
+              <w:t>Supplier / type (read)</w:t>
+            </w:r>
+          </w:p>
+        </w:tc>
+        <w:tc>
+          <w:tcPr>
+            <w:tcW w:type="dxa" w:w="4320"/>
+          </w:tcPr>
+          <w:p>
+            <w:r/>
+            <w:r>
+              <w:rPr>
+                <w:rFonts w:ascii="Calibri" w:hAnsi="Calibri" w:eastAsia="Calibri"/>
+                <w:b w:val="0"/>
+                <w:i w:val="0"/>
+                <w:sz w:val="20"/>
+              </w:rPr>
+              <w:t>1000001737 / ZAPO via get_A_PurchaseOrder</w:t>
+            </w:r>
+          </w:p>
+        </w:tc>
+      </w:tr>
+      <w:tr>
+        <w:tc>
+          <w:tcPr>
+            <w:tcW w:type="dxa" w:w="4320"/>
+          </w:tcPr>
+          <w:p>
+            <w:r/>
+            <w:r>
+              <w:rPr>
+                <w:rFonts w:ascii="Calibri" w:hAnsi="Calibri" w:eastAsia="Calibri"/>
+                <w:b w:val="0"/>
+                <w:i w:val="0"/>
+                <w:sz w:val="20"/>
+              </w:rPr>
+              <w:t>Budget</w:t>
+            </w:r>
+          </w:p>
+        </w:tc>
+        <w:tc>
+          <w:tcPr>
+            <w:tcW w:type="dxa" w:w="4320"/>
+          </w:tcPr>
+          <w:p>
+            <w:r/>
+            <w:r>
+              <w:rPr>
+                <w:rFonts w:ascii="Calibri" w:hAnsi="Calibri" w:eastAsia="Calibri"/>
+                <w:b w:val="0"/>
+                <w:i w:val="0"/>
+                <w:sz w:val="20"/>
+              </w:rPr>
+              <w:t>ok via fi_Validate</w:t>
+            </w:r>
+          </w:p>
+        </w:tc>
+      </w:tr>
+      <w:tr>
+        <w:tc>
+          <w:tcPr>
+            <w:tcW w:type="dxa" w:w="4320"/>
+          </w:tcPr>
+          <w:p>
+            <w:r/>
+            <w:r>
+              <w:rPr>
+                <w:rFonts w:ascii="Calibri" w:hAnsi="Calibri" w:eastAsia="Calibri"/>
+                <w:b w:val="0"/>
+                <w:i w:val="0"/>
+                <w:sz w:val="20"/>
+              </w:rPr>
+              <w:t>POST</w:t>
+            </w:r>
+          </w:p>
+        </w:tc>
+        <w:tc>
+          <w:tcPr>
+            <w:tcW w:type="dxa" w:w="4320"/>
+          </w:tcPr>
+          <w:p>
+            <w:r/>
+            <w:r>
+              <w:rPr>
+                <w:rFonts w:ascii="Calibri" w:hAnsi="Calibri" w:eastAsia="Calibri"/>
+                <w:b w:val="0"/>
+                <w:i w:val="0"/>
+                <w:sz w:val="20"/>
+              </w:rPr>
+              <w:t>hikma post_A_PurchaseOrder, PurchaseOrderType NB, PurchasingOrganization CPO, sealed true, called false</w:t>
+            </w:r>
+          </w:p>
+        </w:tc>
+      </w:tr>
+    </w:tbl>
+    <w:p/>
+    <w:p>
+      <w:r>
+        <w:rPr>
+          <w:rFonts w:ascii="Calibri" w:hAnsi="Calibri" w:eastAsia="Calibri"/>
+          <w:b w:val="0"/>
+          <w:i/>
+          <w:sz w:val="22"/>
+        </w:rPr>
+        <w:t>Ask → Write status: No. The write station stays sealed. A cycle can compile a dossier; SAP is not written until you decide.</w:t>
+      </w:r>
+    </w:p>
+    <w:p>
+      <w:r>
+        <w:rPr>
+          <w:rFonts w:ascii="Calibri" w:hAnsi="Calibri" w:eastAsia="Calibri"/>
+          <w:b w:val="0"/>
+          <w:i w:val="0"/>
+          <w:sz w:val="22"/>
+        </w:rPr>
+        <w:t>The exact PR can move on a later read. The tools and the sealed POST must not.</w:t>
       </w:r>
     </w:p>
     <w:p>
       <w:pPr>
-        <w:pStyle w:val="ListBullet"/>
+        <w:pStyle w:val="Heading2"/>
       </w:pPr>
       <w:r>
-        <w:t>Start a cycle — opens an observable Run on system PR to PO. Approve/reject still does not unseal the SAP write.</w:t>
+        <w:t>Exact labels on the desk</w:t>
       </w:r>
     </w:p>
+    <w:tbl>
+      <w:tblPr>
+        <w:tblStyle w:val="TableGrid"/>
+        <w:tblW w:type="auto" w:w="0"/>
+        <w:tblLook w:firstColumn="1" w:firstRow="1" w:lastColumn="0" w:lastRow="0" w:noHBand="0" w:noVBand="1" w:val="04A0"/>
+      </w:tblPr>
+      <w:tblGrid>
+        <w:gridCol w:w="4320"/>
+        <w:gridCol w:w="4320"/>
+      </w:tblGrid>
+      <w:tr>
+        <w:tc>
+          <w:tcPr>
+            <w:tcW w:type="dxa" w:w="4320"/>
+          </w:tcPr>
+          <w:p>
+            <w:r/>
+            <w:r>
+              <w:rPr>
+                <w:rFonts w:ascii="Calibri" w:hAnsi="Calibri" w:eastAsia="Calibri"/>
+                <w:b/>
+                <w:i w:val="0"/>
+                <w:sz w:val="20"/>
+              </w:rPr>
+              <w:t>Place</w:t>
+            </w:r>
+          </w:p>
+        </w:tc>
+        <w:tc>
+          <w:tcPr>
+            <w:tcW w:type="dxa" w:w="4320"/>
+          </w:tcPr>
+          <w:p>
+            <w:r/>
+            <w:r>
+              <w:rPr>
+                <w:rFonts w:ascii="Calibri" w:hAnsi="Calibri" w:eastAsia="Calibri"/>
+                <w:b/>
+                <w:i w:val="0"/>
+                <w:sz w:val="20"/>
+              </w:rPr>
+              <w:t>English</w:t>
+            </w:r>
+          </w:p>
+        </w:tc>
+      </w:tr>
+      <w:tr>
+        <w:tc>
+          <w:tcPr>
+            <w:tcW w:type="dxa" w:w="4320"/>
+          </w:tcPr>
+          <w:p>
+            <w:r/>
+            <w:r>
+              <w:rPr>
+                <w:rFonts w:ascii="Calibri" w:hAnsi="Calibri" w:eastAsia="Calibri"/>
+                <w:b w:val="0"/>
+                <w:i w:val="0"/>
+                <w:sz w:val="20"/>
+              </w:rPr>
+              <w:t>Title</w:t>
+            </w:r>
+          </w:p>
+        </w:tc>
+        <w:tc>
+          <w:tcPr>
+            <w:tcW w:type="dxa" w:w="4320"/>
+          </w:tcPr>
+          <w:p>
+            <w:r/>
+            <w:r>
+              <w:rPr>
+                <w:rFonts w:ascii="Calibri" w:hAnsi="Calibri" w:eastAsia="Calibri"/>
+                <w:b w:val="0"/>
+                <w:i w:val="0"/>
+                <w:sz w:val="20"/>
+              </w:rPr>
+              <w:t>PR to PO</w:t>
+            </w:r>
+          </w:p>
+        </w:tc>
+      </w:tr>
+      <w:tr>
+        <w:tc>
+          <w:tcPr>
+            <w:tcW w:type="dxa" w:w="4320"/>
+          </w:tcPr>
+          <w:p>
+            <w:r/>
+            <w:r>
+              <w:rPr>
+                <w:rFonts w:ascii="Calibri" w:hAnsi="Calibri" w:eastAsia="Calibri"/>
+                <w:b w:val="0"/>
+                <w:i w:val="0"/>
+                <w:sz w:val="20"/>
+              </w:rPr>
+              <w:t>Primary / secondary</w:t>
+            </w:r>
+          </w:p>
+        </w:tc>
+        <w:tc>
+          <w:tcPr>
+            <w:tcW w:type="dxa" w:w="4320"/>
+          </w:tcPr>
+          <w:p>
+            <w:r/>
+            <w:r>
+              <w:rPr>
+                <w:rFonts w:ascii="Calibri" w:hAnsi="Calibri" w:eastAsia="Calibri"/>
+                <w:b w:val="0"/>
+                <w:i w:val="0"/>
+                <w:sz w:val="20"/>
+              </w:rPr>
+              <w:t>Run the factory · Start a cycle</w:t>
+            </w:r>
+          </w:p>
+        </w:tc>
+      </w:tr>
+      <w:tr>
+        <w:tc>
+          <w:tcPr>
+            <w:tcW w:type="dxa" w:w="4320"/>
+          </w:tcPr>
+          <w:p>
+            <w:r/>
+            <w:r>
+              <w:rPr>
+                <w:rFonts w:ascii="Calibri" w:hAnsi="Calibri" w:eastAsia="Calibri"/>
+                <w:b w:val="0"/>
+                <w:i w:val="0"/>
+                <w:sz w:val="20"/>
+              </w:rPr>
+              <w:t>Dossier</w:t>
+            </w:r>
+          </w:p>
+        </w:tc>
+        <w:tc>
+          <w:tcPr>
+            <w:tcW w:type="dxa" w:w="4320"/>
+          </w:tcPr>
+          <w:p>
+            <w:r/>
+            <w:r>
+              <w:rPr>
+                <w:rFonts w:ascii="Calibri" w:hAnsi="Calibri" w:eastAsia="Calibri"/>
+                <w:b w:val="0"/>
+                <w:i w:val="0"/>
+                <w:sz w:val="20"/>
+              </w:rPr>
+              <w:t>Compiled dossier / Compiled from the live SAP reads.</w:t>
+            </w:r>
+          </w:p>
+        </w:tc>
+      </w:tr>
+      <w:tr>
+        <w:tc>
+          <w:tcPr>
+            <w:tcW w:type="dxa" w:w="4320"/>
+          </w:tcPr>
+          <w:p>
+            <w:r/>
+            <w:r>
+              <w:rPr>
+                <w:rFonts w:ascii="Calibri" w:hAnsi="Calibri" w:eastAsia="Calibri"/>
+                <w:b w:val="0"/>
+                <w:i w:val="0"/>
+                <w:sz w:val="20"/>
+              </w:rPr>
+              <w:t>Dossier actions</w:t>
+            </w:r>
+          </w:p>
+        </w:tc>
+        <w:tc>
+          <w:tcPr>
+            <w:tcW w:type="dxa" w:w="4320"/>
+          </w:tcPr>
+          <w:p>
+            <w:r/>
+            <w:r>
+              <w:rPr>
+                <w:rFonts w:ascii="Calibri" w:hAnsi="Calibri" w:eastAsia="Calibri"/>
+                <w:b w:val="0"/>
+                <w:i w:val="0"/>
+                <w:sz w:val="20"/>
+              </w:rPr>
+              <w:t>Read selected requisition · Summarise</w:t>
+            </w:r>
+          </w:p>
+        </w:tc>
+      </w:tr>
+      <w:tr>
+        <w:tc>
+          <w:tcPr>
+            <w:tcW w:type="dxa" w:w="4320"/>
+          </w:tcPr>
+          <w:p>
+            <w:r/>
+            <w:r>
+              <w:rPr>
+                <w:rFonts w:ascii="Calibri" w:hAnsi="Calibri" w:eastAsia="Calibri"/>
+                <w:b w:val="0"/>
+                <w:i w:val="0"/>
+                <w:sz w:val="20"/>
+              </w:rPr>
+              <w:t>Draft card</w:t>
+            </w:r>
+          </w:p>
+        </w:tc>
+        <w:tc>
+          <w:tcPr>
+            <w:tcW w:type="dxa" w:w="4320"/>
+          </w:tcPr>
+          <w:p>
+            <w:r/>
+            <w:r>
+              <w:rPr>
+                <w:rFonts w:ascii="Calibri" w:hAnsi="Calibri" w:eastAsia="Calibri"/>
+                <w:b w:val="0"/>
+                <w:i w:val="0"/>
+                <w:sz w:val="20"/>
+              </w:rPr>
+              <w:t>Draft · Purchase order composed for SAP</w:t>
+            </w:r>
+          </w:p>
+        </w:tc>
+      </w:tr>
+      <w:tr>
+        <w:tc>
+          <w:tcPr>
+            <w:tcW w:type="dxa" w:w="4320"/>
+          </w:tcPr>
+          <w:p>
+            <w:r/>
+            <w:r>
+              <w:rPr>
+                <w:rFonts w:ascii="Calibri" w:hAnsi="Calibri" w:eastAsia="Calibri"/>
+                <w:b w:val="0"/>
+                <w:i w:val="0"/>
+                <w:sz w:val="20"/>
+              </w:rPr>
+              <w:t>Ask chips</w:t>
+            </w:r>
+          </w:p>
+        </w:tc>
+        <w:tc>
+          <w:tcPr>
+            <w:tcW w:type="dxa" w:w="4320"/>
+          </w:tcPr>
+          <w:p>
+            <w:r/>
+            <w:r>
+              <w:rPr>
+                <w:rFonts w:ascii="Calibri" w:hAnsi="Calibri" w:eastAsia="Calibri"/>
+                <w:b w:val="0"/>
+                <w:i w:val="0"/>
+                <w:sz w:val="20"/>
+              </w:rPr>
+              <w:t>Majority supplier · Orders read · Next step · Write status</w:t>
+            </w:r>
+          </w:p>
+        </w:tc>
+      </w:tr>
+      <w:tr>
+        <w:tc>
+          <w:tcPr>
+            <w:tcW w:type="dxa" w:w="4320"/>
+          </w:tcPr>
+          <w:p>
+            <w:r/>
+            <w:r>
+              <w:rPr>
+                <w:rFonts w:ascii="Calibri" w:hAnsi="Calibri" w:eastAsia="Calibri"/>
+                <w:b w:val="0"/>
+                <w:i w:val="0"/>
+                <w:sz w:val="20"/>
+              </w:rPr>
+              <w:t>Portal</w:t>
+            </w:r>
+          </w:p>
+        </w:tc>
+        <w:tc>
+          <w:tcPr>
+            <w:tcW w:type="dxa" w:w="4320"/>
+          </w:tcPr>
+          <w:p>
+            <w:r/>
+            <w:r>
+              <w:rPr>
+                <w:rFonts w:ascii="Calibri" w:hAnsi="Calibri" w:eastAsia="Calibri"/>
+                <w:b w:val="0"/>
+                <w:i w:val="0"/>
+                <w:sz w:val="20"/>
+              </w:rPr>
+              <w:t>Open the portal · Factory portal</w:t>
+            </w:r>
+          </w:p>
+        </w:tc>
+      </w:tr>
+      <w:tr>
+        <w:tc>
+          <w:tcPr>
+            <w:tcW w:type="dxa" w:w="4320"/>
+          </w:tcPr>
+          <w:p>
+            <w:r/>
+            <w:r>
+              <w:rPr>
+                <w:rFonts w:ascii="Calibri" w:hAnsi="Calibri" w:eastAsia="Calibri"/>
+                <w:b w:val="0"/>
+                <w:i w:val="0"/>
+                <w:sz w:val="20"/>
+              </w:rPr>
+              <w:t>Write station</w:t>
+            </w:r>
+          </w:p>
+        </w:tc>
+        <w:tc>
+          <w:tcPr>
+            <w:tcW w:type="dxa" w:w="4320"/>
+          </w:tcPr>
+          <w:p>
+            <w:r/>
+            <w:r>
+              <w:rPr>
+                <w:rFonts w:ascii="Calibri" w:hAnsi="Calibri" w:eastAsia="Calibri"/>
+                <w:b w:val="0"/>
+                <w:i w:val="0"/>
+                <w:sz w:val="20"/>
+              </w:rPr>
+              <w:t>Sealed</w:t>
+            </w:r>
+          </w:p>
+        </w:tc>
+      </w:tr>
+    </w:tbl>
+    <w:p/>
     <w:p>
-      <w:pPr>
-        <w:pStyle w:val="ListBullet"/>
-      </w:pPr>
       <w:r>
-        <w:t>Open the Flow / Open the System — the published graph, not required for the four proofs.</w:t>
-      </w:r>
-    </w:p>
-    <w:p>
-      <w:pPr>
-        <w:pStyle w:val="ListBullet"/>
-      </w:pPr>
-      <w:r>
-        <w:t>Connections — one MCP card. OAuth already set on sap / hikma / sap_inbox / sap_gr.</w:t>
+        <w:rPr>
+          <w:rFonts w:ascii="Calibri" w:hAnsi="Calibri" w:eastAsia="Calibri"/>
+          <w:b w:val="0"/>
+          <w:i w:val="0"/>
+          <w:sz w:val="22"/>
+        </w:rPr>
+        <w:t>Banned on this desk: pipeline, workflow, job. Removed: Success criteria, numbered beats 1–4, Shown / Play / Waiting, “Compose the POST is the success of this demo”.</w:t>
       </w:r>
     </w:p>
     <w:p>
@@ -693,7 +2021,13 @@
         <w:pStyle w:val="ListBullet"/>
       </w:pPr>
       <w:r>
-        <w:t>0:00 — URL, nawa, English, hard-reload.</w:t>
+        <w:rPr>
+          <w:rFonts w:ascii="Calibri" w:hAnsi="Calibri" w:eastAsia="Calibri"/>
+          <w:b w:val="0"/>
+          <w:i w:val="0"/>
+          <w:sz w:val="22"/>
+        </w:rPr>
+        <w:t>0:00 — URL, nawa, English, hard-reload. “Operator desk. Not a slide.”</w:t>
       </w:r>
     </w:p>
     <w:p>
@@ -701,7 +2035,13 @@
         <w:pStyle w:val="ListBullet"/>
       </w:pPr>
       <w:r>
-        <w:t>0:30 — Briefing + counts. “Live SAP, through MCP.”</w:t>
+        <w:rPr>
+          <w:rFonts w:ascii="Calibri" w:hAnsi="Calibri" w:eastAsia="Calibri"/>
+          <w:b w:val="0"/>
+          <w:i w:val="0"/>
+          <w:sz w:val="22"/>
+        </w:rPr>
+        <w:t>0:30 — Counts + stations. “Live SAP, through MCP. No HANA.”</w:t>
       </w:r>
     </w:p>
     <w:p>
@@ -709,7 +2049,13 @@
         <w:pStyle w:val="ListBullet"/>
       </w:pPr>
       <w:r>
-        <w:t>1:30 — Dossier. Tools on the facts. Justification summary.</w:t>
+        <w:rPr>
+          <w:rFonts w:ascii="Calibri" w:hAnsi="Calibri" w:eastAsia="Calibri"/>
+          <w:b w:val="0"/>
+          <w:i w:val="0"/>
+          <w:sz w:val="22"/>
+        </w:rPr>
+        <w:t>1:30 — Dossier + Read selected requisition + Summarise. “One short model call. Two sentences. Nothing invented.”</w:t>
       </w:r>
     </w:p>
     <w:p>
@@ -717,7 +2063,13 @@
         <w:pStyle w:val="ListBullet"/>
       </w:pPr>
       <w:r>
-        <w:t>3:00 — Draft order. NB, sealed, not sent. Honesty line.</w:t>
+        <w:rPr>
+          <w:rFonts w:ascii="Calibri" w:hAnsi="Calibri" w:eastAsia="Calibri"/>
+          <w:b w:val="0"/>
+          <w:i w:val="0"/>
+          <w:sz w:val="22"/>
+        </w:rPr>
+        <w:t>3:00 — Draft card. “Type NB, sealed, not sent. Client 300 has no NB range.”</w:t>
       </w:r>
     </w:p>
     <w:p>
@@ -725,7 +2077,13 @@
         <w:pStyle w:val="ListBullet"/>
       </w:pPr>
       <w:r>
-        <w:t>5:00 — Write status, then Open the portal with a get-PR / get-PO question.</w:t>
+        <w:rPr>
+          <w:rFonts w:ascii="Calibri" w:hAnsi="Calibri" w:eastAsia="Calibri"/>
+          <w:b w:val="0"/>
+          <w:i w:val="0"/>
+          <w:sz w:val="22"/>
+        </w:rPr>
+        <w:t>5:00 — Write status, then Open the portal if there is time.</w:t>
       </w:r>
     </w:p>
     <w:p>
@@ -733,7 +2091,13 @@
         <w:pStyle w:val="ListBullet"/>
       </w:pPr>
       <w:r>
-        <w:t>6:30 — Stop. Write still Sealed. Offer the cycle only if they ask.</w:t>
+        <w:rPr>
+          <w:rFonts w:ascii="Calibri" w:hAnsi="Calibri" w:eastAsia="Calibri"/>
+          <w:b w:val="0"/>
+          <w:i w:val="0"/>
+          <w:sz w:val="22"/>
+        </w:rPr>
+        <w:t>6:30 — Stop. Write still Sealed. Offer Start a cycle only if they ask.</w:t>
       </w:r>
     </w:p>
     <w:p>
@@ -741,7 +2105,7 @@
         <w:pStyle w:val="Heading2"/>
       </w:pPr>
       <w:r>
-        <w:t>If something is empty</w:t>
+        <w:t>If something looks wrong</w:t>
       </w:r>
     </w:p>
     <w:p>
@@ -749,7 +2113,13 @@
         <w:pStyle w:val="ListBullet"/>
       </w:pPr>
       <w:r>
-        <w:t>Counts at 0: click Run the factory once and wait. A timeout on tools/call often recovers on the next run. A 407 / “Token has expired” needs the SAP MCP applications restarted, not a new Agentium password.</w:t>
+        <w:rPr>
+          <w:rFonts w:ascii="Calibri" w:hAnsi="Calibri" w:eastAsia="Calibri"/>
+          <w:b w:val="0"/>
+          <w:i w:val="0"/>
+          <w:sz w:val="22"/>
+        </w:rPr>
+        <w:t>Old tiles Shown / Play / Success criteria → hard-reload. Removed on cd40fe33.</w:t>
       </w:r>
     </w:p>
     <w:p>
@@ -757,7 +2127,13 @@
         <w:pStyle w:val="ListBullet"/>
       </w:pPr>
       <w:r>
-        <w:t>Empty justification: wait, then Read selected requisition once. Summarise once. Do not spam it.</w:t>
+        <w:rPr>
+          <w:rFonts w:ascii="Calibri" w:hAnsi="Calibri" w:eastAsia="Calibri"/>
+          <w:b w:val="0"/>
+          <w:i w:val="0"/>
+          <w:sz w:val="22"/>
+        </w:rPr>
+        <w:t>Blank desk / login loop → login, then hard-reload this desk URL. Do not open / first.</w:t>
       </w:r>
     </w:p>
     <w:p>
@@ -765,7 +2141,13 @@
         <w:pStyle w:val="ListBullet"/>
       </w:pPr>
       <w:r>
-        <w:t>No draft order: we need a live PR id and a majority supplier. Run the factory again.</w:t>
+        <w:rPr>
+          <w:rFonts w:ascii="Calibri" w:hAnsi="Calibri" w:eastAsia="Calibri"/>
+          <w:b w:val="0"/>
+          <w:i w:val="0"/>
+          <w:sz w:val="22"/>
+        </w:rPr>
+        <w:t>token expired or HTTP 407 → restart the Hikma Cloud Foundry MCP apps, not the Agentium password.</w:t>
       </w:r>
     </w:p>
     <w:p>
@@ -773,7 +2155,13 @@
         <w:pStyle w:val="ListBullet"/>
       </w:pPr>
       <w:r>
-        <w:t>Portal offline: lineage should show system PR to PO. Run the factory so the binding is resolved.</w:t>
+        <w:rPr>
+          <w:rFonts w:ascii="Calibri" w:hAnsi="Calibri" w:eastAsia="Calibri"/>
+          <w:b w:val="0"/>
+          <w:i w:val="0"/>
+          <w:sz w:val="22"/>
+        </w:rPr>
+        <w:t>Counts at 0 → Run the factory once and wait.</w:t>
       </w:r>
     </w:p>
     <w:p>
@@ -781,7 +2169,55 @@
         <w:pStyle w:val="ListBullet"/>
       </w:pPr>
       <w:r>
-        <w:t>Goods receipts 0 / limited: expected. sap_gr is often 403. Do not dwell.</w:t>
+        <w:rPr>
+          <w:rFonts w:ascii="Calibri" w:hAnsi="Calibri" w:eastAsia="Calibri"/>
+          <w:b w:val="0"/>
+          <w:i w:val="0"/>
+          <w:sz w:val="22"/>
+        </w:rPr>
+        <w:t>Empty justification → Read selected requisition once, then Summarise once.</w:t>
+      </w:r>
+    </w:p>
+    <w:p>
+      <w:pPr>
+        <w:pStyle w:val="ListBullet"/>
+      </w:pPr>
+      <w:r>
+        <w:rPr>
+          <w:rFonts w:ascii="Calibri" w:hAnsi="Calibri" w:eastAsia="Calibri"/>
+          <w:b w:val="0"/>
+          <w:i w:val="0"/>
+          <w:sz w:val="22"/>
+        </w:rPr>
+        <w:t>Write still Sealed after Run → correct.</w:t>
+      </w:r>
+    </w:p>
+    <w:p>
+      <w:pPr>
+        <w:pStyle w:val="ListBullet"/>
+      </w:pPr>
+      <w:r>
+        <w:rPr>
+          <w:rFonts w:ascii="Calibri" w:hAnsi="Calibri" w:eastAsia="Calibri"/>
+          <w:b w:val="0"/>
+          <w:i w:val="0"/>
+          <w:sz w:val="22"/>
+        </w:rPr>
+        <w:t>Receipts 0 / Limited read → expected. sap_gr is often 403.</w:t>
+      </w:r>
+    </w:p>
+    <w:p>
+      <w:pPr>
+        <w:pStyle w:val="ListBullet"/>
+      </w:pPr>
+      <w:r>
+        <w:rPr>
+          <w:rFonts w:ascii="Calibri" w:hAnsi="Calibri" w:eastAsia="Calibri"/>
+          <w:b w:val="0"/>
+          <w:i w:val="0"/>
+          <w:sz w:val="22"/>
+        </w:rPr>
+        <w:t>Someone asks to create the PO live → refuse. The composed POST is the artefact.</w:t>
       </w:r>
     </w:p>
     <w:p>
@@ -789,7 +2225,7 @@
         <w:pStyle w:val="Heading2"/>
       </w:pPr>
       <w:r>
-        <w:t>What we will not do in the room</w:t>
+        <w:t>Do not</w:t>
       </w:r>
     </w:p>
     <w:p>
@@ -797,7 +2233,13 @@
         <w:pStyle w:val="ListBullet"/>
       </w:pPr>
       <w:r>
-        <w:t>No live post_A_PurchaseOrder tools/call.</w:t>
+        <w:rPr>
+          <w:rFonts w:ascii="Calibri" w:hAnsi="Calibri" w:eastAsia="Calibri"/>
+          <w:b w:val="0"/>
+          <w:i w:val="0"/>
+          <w:sz w:val="22"/>
+        </w:rPr>
+        <w:t>Do not post a purchase order. No tools/call on post_A_PurchaseOrder.</w:t>
       </w:r>
     </w:p>
     <w:p>
@@ -805,7 +2247,13 @@
         <w:pStyle w:val="ListBullet"/>
       </w:pPr>
       <w:r>
-        <w:t>No fi_EnableForPurchasing. No invented YY1_* / A_* aliases.</w:t>
+        <w:rPr>
+          <w:rFonts w:ascii="Calibri" w:hAnsi="Calibri" w:eastAsia="Calibri"/>
+          <w:b w:val="0"/>
+          <w:i w:val="0"/>
+          <w:sz w:val="22"/>
+        </w:rPr>
+        <w:t>Do not call fi_EnableForPurchasing or fi_Discard.</w:t>
       </w:r>
     </w:p>
     <w:p>
@@ -813,7 +2261,13 @@
         <w:pStyle w:val="ListBullet"/>
       </w:pPr>
       <w:r>
-        <w:t>No HANA story. No claim that ZAPO was created.</w:t>
+        <w:rPr>
+          <w:rFonts w:ascii="Calibri" w:hAnsi="Calibri" w:eastAsia="Calibri"/>
+          <w:b w:val="0"/>
+          <w:i w:val="0"/>
+          <w:sz w:val="22"/>
+        </w:rPr>
+        <w:t>Do not invent MCP aliases (A_*, YY1_*). Do not turn HANA on.</w:t>
       </w:r>
     </w:p>
     <w:p>
@@ -821,7 +2275,41 @@
         <w:pStyle w:val="ListBullet"/>
       </w:pPr>
       <w:r>
-        <w:t>No password on a slide. No OAuth secret on screen.</w:t>
+        <w:rPr>
+          <w:rFonts w:ascii="Calibri" w:hAnsi="Calibri" w:eastAsia="Calibri"/>
+          <w:b w:val="0"/>
+          <w:i w:val="0"/>
+          <w:sz w:val="22"/>
+        </w:rPr>
+        <w:t>Do not seed nawa on this VM. Do not move the demo-agentic tag.</w:t>
+      </w:r>
+    </w:p>
+    <w:p>
+      <w:pPr>
+        <w:pStyle w:val="ListBullet"/>
+      </w:pPr>
+      <w:r>
+        <w:rPr>
+          <w:rFonts w:ascii="Calibri" w:hAnsi="Calibri" w:eastAsia="Calibri"/>
+          <w:b w:val="0"/>
+          <w:i w:val="0"/>
+          <w:sz w:val="22"/>
+        </w:rPr>
+        <w:t>Do not put the four proofs back on the screen as numbered tiles.</w:t>
+      </w:r>
+    </w:p>
+    <w:p>
+      <w:pPr>
+        <w:pStyle w:val="ListBullet"/>
+      </w:pPr>
+      <w:r>
+        <w:rPr>
+          <w:rFonts w:ascii="Calibri" w:hAnsi="Calibri" w:eastAsia="Calibri"/>
+          <w:b w:val="0"/>
+          <w:i w:val="0"/>
+          <w:sz w:val="22"/>
+        </w:rPr>
+        <w:t>Do not put a password or an OAuth secret on a slide.</w:t>
       </w:r>
     </w:p>
     <w:p>
@@ -829,7 +2317,7 @@
         <w:pStyle w:val="Heading2"/>
       </w:pPr>
       <w:r>
-        <w:t>Technical anchors (if an engineer asks)</w:t>
+        <w:t>Technical anchors</w:t>
       </w:r>
     </w:p>
     <w:p>
@@ -837,7 +2325,13 @@
         <w:pStyle w:val="ListBullet"/>
       </w:pPr>
       <w:r>
-        <w:t>Workspace nawa · Experience slug pr-to-po · Binding procurement.pr_to_po.run</w:t>
+        <w:rPr>
+          <w:rFonts w:ascii="Calibri" w:hAnsi="Calibri" w:eastAsia="Calibri"/>
+          <w:b w:val="0"/>
+          <w:i w:val="0"/>
+          <w:sz w:val="22"/>
+        </w:rPr>
+        <w:t>Desk /work/pr-to-po · Binding procurement.pr_to_po.run · System 28345b5a-…</w:t>
       </w:r>
     </w:p>
     <w:p>
@@ -845,7 +2339,13 @@
         <w:pStyle w:val="ListBullet"/>
       </w:pPr>
       <w:r>
-        <w:t>System 28345b5a-0824-4f2b-a420-ebe0aa7cd34f · published flow v2 b9217063-b512-48e8-a444-835867a3de76</w:t>
+        <w:rPr>
+          <w:rFonts w:ascii="Calibri" w:hAnsi="Calibri" w:eastAsia="Calibri"/>
+          <w:b w:val="0"/>
+          <w:i w:val="0"/>
+          <w:sz w:val="22"/>
+        </w:rPr>
+        <w:t>Images agentium-{backend,worker,frontend}:cd40fe337285</w:t>
       </w:r>
     </w:p>
     <w:p>
@@ -853,7 +2353,13 @@
         <w:pStyle w:val="ListBullet"/>
       </w:pPr>
       <w:r>
-        <w:t>Desk: /work/pr-to-po · MCP read plane only for writes (compose, HTTP 400 “not a read” if forced)</w:t>
+        <w:rPr>
+          <w:rFonts w:ascii="Calibri" w:hAnsi="Calibri" w:eastAsia="Calibri"/>
+          <w:b w:val="0"/>
+          <w:i w:val="0"/>
+          <w:sz w:val="22"/>
+        </w:rPr>
+        <w:t>Rollback of this desk slice: AGENTIUM_IMAGE_TAG=3eb72f95f6b6</w:t>
       </w:r>
     </w:p>
     <w:p>
@@ -861,13 +2367,50 @@
         <w:pStyle w:val="ListBullet"/>
       </w:pPr>
       <w:r>
-        <w:t>The UI does not number the four proofs. Those reminders live only in this document.</w:t>
+        <w:rPr>
+          <w:rFonts w:ascii="Calibri" w:hAnsi="Calibri" w:eastAsia="Calibri"/>
+          <w:b w:val="0"/>
+          <w:i w:val="0"/>
+          <w:sz w:val="22"/>
+        </w:rPr>
+        <w:t>Writes via /read → HTTP 400 “not a read”.</w:t>
+      </w:r>
+    </w:p>
+    <w:p>
+      <w:pPr>
+        <w:pStyle w:val="ListBullet"/>
+      </w:pPr>
+      <w:r>
+        <w:rPr>
+          <w:rFonts w:ascii="Calibri" w:hAnsi="Calibri" w:eastAsia="Calibri"/>
+          <w:b w:val="0"/>
+          <w:i w:val="0"/>
+          <w:sz w:val="22"/>
+        </w:rPr>
+        <w:t>Markdown source: docs/ops/nawa-pr-to-po-live-demo-playbook.md</w:t>
+      </w:r>
+    </w:p>
+    <w:p>
+      <w:pPr>
+        <w:pStyle w:val="ListBullet"/>
+      </w:pPr>
+      <w:r>
+        <w:rPr>
+          <w:rFonts w:ascii="Calibri" w:hAnsi="Calibri" w:eastAsia="Calibri"/>
+          <w:b w:val="0"/>
+          <w:i w:val="0"/>
+          <w:sz w:val="22"/>
+        </w:rPr>
+        <w:t>Presenter card (FR): docs/ops/nawa-pr-to-po-live-demo-presenter-fr.md</w:t>
       </w:r>
     </w:p>
     <w:p>
       <w:r>
         <w:rPr>
+          <w:rFonts w:ascii="Calibri" w:hAnsi="Calibri" w:eastAsia="Calibri"/>
           <w:b/>
+          <w:i w:val="0"/>
+          <w:sz w:val="22"/>
         </w:rPr>
         <w:t>End of playbook. Walk the desk. Leave SAP sealed.</w:t>
       </w:r>

</xml_diff>

<commit_message>
fix(desk): use brief, not dossier, in English PR to PO copy
The EN desk was a full translation, but dossier and terrain were French
loanwords on the POC screen. Replace them with brief / read and pin the
guard in the i18n spec.

Co-authored-by: thibaud.ishacian <thibaud.ishacian@gmail.com>
</commit_message>
<xml_diff>
--- a/docs/ops/nawa-pr-to-po-live-demo-playbook.docx
+++ b/docs/ops/nawa-pr-to-po-live-demo-playbook.docx
@@ -265,7 +265,7 @@
           <w:i/>
           <w:sz w:val="22"/>
         </w:rPr>
-        <w:t>Subtitle: System → Flow → Run → Decision. The factory reads Hikma, compiles a dossier, and writes nothing to SAP until you decide.</w:t>
+        <w:t>Subtitle: System → Flow → Run → Decision. The factory reads Hikma, compiles a brief, and writes nothing to SAP until you decide.</w:t>
       </w:r>
     </w:p>
     <w:p>
@@ -417,7 +417,7 @@
                 <w:i w:val="0"/>
                 <w:sz w:val="20"/>
               </w:rPr>
-              <w:t>KPI row, stations, Read selected requisition, dossier facts</w:t>
+              <w:t>KPI row, stations, Read selected requisition, brief facts</w:t>
             </w:r>
           </w:p>
         </w:tc>
@@ -487,7 +487,7 @@
                 <w:i w:val="0"/>
                 <w:sz w:val="20"/>
               </w:rPr>
-              <w:t>Summarise in the compiled dossier</w:t>
+              <w:t>Summarise in the compiled brief</w:t>
             </w:r>
           </w:p>
         </w:tc>
@@ -695,7 +695,7 @@
           <w:i w:val="0"/>
           <w:sz w:val="22"/>
         </w:rPr>
-        <w:t>Click Run the factory. Wait until Compile is Done and the hero reads something like “Dossier compiled on STICKER WHITE — majority supplier 1000001737.”</w:t>
+        <w:t>Click Run the factory. Wait until Compile is Done and the hero reads something like “Brief compiled on STICKER WHITE — majority supplier 1000001737.”</w:t>
       </w:r>
     </w:p>
     <w:p>
@@ -773,7 +773,7 @@
           <w:i/>
           <w:sz w:val="22"/>
         </w:rPr>
-        <w:t>Talk track: “This is the PR to PO factory. It reads Hikma through MCP, compiles a dossier, and writes nothing until a human decides.”</w:t>
+        <w:t>Talk track: “This is the PR to PO factory. It reads Hikma through MCP, compiles a brief, and writes nothing until a human decides.”</w:t>
       </w:r>
     </w:p>
     <w:p>
@@ -800,14 +800,14 @@
           <w:i w:val="0"/>
           <w:sz w:val="22"/>
         </w:rPr>
-        <w:t>Lineage, briefing, counts, stations, compiled dossier. Actions in the dossier header: Read selected requisition, Summarise.</w:t>
+        <w:t>Lineage, briefing, counts, stations, compiled brief. Actions in the brief header: Read selected requisition, Summarise.</w:t>
       </w:r>
     </w:p>
     <w:p>
       <w:r>
         <w:drawing>
           <wp:inline xmlns:a="http://schemas.openxmlformats.org/drawingml/2006/main" xmlns:pic="http://schemas.openxmlformats.org/drawingml/2006/picture">
-            <wp:extent cx="5852160" cy="4470400"/>
+            <wp:extent cx="5852160" cy="4876800"/>
             <wp:docPr id="1" name="Picture 1"/>
             <wp:cNvGraphicFramePr>
               <a:graphicFrameLocks noChangeAspect="1"/>
@@ -828,7 +828,7 @@
                   <pic:spPr>
                     <a:xfrm>
                       <a:off x="0" y="0"/>
-                      <a:ext cx="5852160" cy="4470400"/>
+                      <a:ext cx="5852160" cy="4876800"/>
                     </a:xfrm>
                     <a:prstGeom prst="rect"/>
                   </pic:spPr>
@@ -859,7 +859,7 @@
         <w:pStyle w:val="Heading3"/>
       </w:pPr>
       <w:r>
-        <w:t>Compiled dossier (proofs 1 and 2)</w:t>
+        <w:t>Compiled brief (proofs 1 and 2)</w:t>
       </w:r>
     </w:p>
     <w:p>
@@ -877,7 +877,7 @@
       <w:r>
         <w:drawing>
           <wp:inline xmlns:a="http://schemas.openxmlformats.org/drawingml/2006/main" xmlns:pic="http://schemas.openxmlformats.org/drawingml/2006/picture">
-            <wp:extent cx="5852160" cy="4470400"/>
+            <wp:extent cx="5852160" cy="12472416"/>
             <wp:docPr id="2" name="Picture 2"/>
             <wp:cNvGraphicFramePr>
               <a:graphicFrameLocks noChangeAspect="1"/>
@@ -898,7 +898,7 @@
                   <pic:spPr>
                     <a:xfrm>
                       <a:off x="0" y="0"/>
-                      <a:ext cx="5852160" cy="4470400"/>
+                      <a:ext cx="5852160" cy="12472416"/>
                     </a:xfrm>
                     <a:prstGeom prst="rect"/>
                   </pic:spPr>
@@ -921,7 +921,7 @@
           <w:color w:val="555555"/>
           <w:sz w:val="18"/>
         </w:rPr>
-        <w:t>Figure 2 — Live counts, stations, and the compiled dossier.</w:t>
+        <w:t>Figure 2 — Live counts, stations, and the compiled brief.</w:t>
       </w:r>
     </w:p>
     <w:p>
@@ -992,7 +992,7 @@
       <w:r>
         <w:drawing>
           <wp:inline xmlns:a="http://schemas.openxmlformats.org/drawingml/2006/main" xmlns:pic="http://schemas.openxmlformats.org/drawingml/2006/picture">
-            <wp:extent cx="5852160" cy="4470400"/>
+            <wp:extent cx="5852160" cy="4876800"/>
             <wp:docPr id="3" name="Picture 3"/>
             <wp:cNvGraphicFramePr>
               <a:graphicFrameLocks noChangeAspect="1"/>
@@ -1013,7 +1013,7 @@
                   <pic:spPr>
                     <a:xfrm>
                       <a:off x="0" y="0"/>
-                      <a:ext cx="5852160" cy="4470400"/>
+                      <a:ext cx="5852160" cy="4876800"/>
                     </a:xfrm>
                     <a:prstGeom prst="rect"/>
                   </pic:spPr>
@@ -1062,7 +1062,7 @@
       <w:r>
         <w:drawing>
           <wp:inline xmlns:a="http://schemas.openxmlformats.org/drawingml/2006/main" xmlns:pic="http://schemas.openxmlformats.org/drawingml/2006/picture">
-            <wp:extent cx="5852160" cy="4470400"/>
+            <wp:extent cx="5852160" cy="4876800"/>
             <wp:docPr id="4" name="Picture 4"/>
             <wp:cNvGraphicFramePr>
               <a:graphicFrameLocks noChangeAspect="1"/>
@@ -1071,11 +1071,11 @@
               <a:graphicData uri="http://schemas.openxmlformats.org/drawingml/2006/picture">
                 <pic:pic>
                   <pic:nvPicPr>
-                    <pic:cNvPr id="0" name="ask.png"/>
+                    <pic:cNvPr id="0" name="post.png"/>
                     <pic:cNvPicPr/>
                   </pic:nvPicPr>
                   <pic:blipFill>
-                    <a:blip r:embed="rId12"/>
+                    <a:blip r:embed="rId11"/>
                     <a:stretch>
                       <a:fillRect/>
                     </a:stretch>
@@ -1083,7 +1083,7 @@
                   <pic:spPr>
                     <a:xfrm>
                       <a:off x="0" y="0"/>
-                      <a:ext cx="5852160" cy="4470400"/>
+                      <a:ext cx="5852160" cy="4876800"/>
                     </a:xfrm>
                     <a:prstGeom prst="rect"/>
                   </pic:spPr>
@@ -1145,7 +1145,7 @@
                     <pic:cNvPicPr/>
                   </pic:nvPicPr>
                   <pic:blipFill>
-                    <a:blip r:embed="rId13"/>
+                    <a:blip r:embed="rId12"/>
                     <a:stretch>
                       <a:fillRect/>
                     </a:stretch>
@@ -1264,7 +1264,7 @@
                 <w:i w:val="0"/>
                 <w:sz w:val="20"/>
               </w:rPr>
-              <w:t>Dossier compiled on STICKER WHITE — majority supplier 1000001737.</w:t>
+              <w:t>Brief compiled on STICKER WHITE — majority supplier 1000001737.</w:t>
             </w:r>
           </w:p>
         </w:tc>
@@ -1639,7 +1639,7 @@
           <w:i/>
           <w:sz w:val="22"/>
         </w:rPr>
-        <w:t>Ask → Write status: No. The write station stays sealed. A cycle can compile a dossier; SAP is not written until you decide.</w:t>
+        <w:t>Ask → Write status: No. The write station stays sealed. A cycle can compile a brief; SAP is not written until you decide.</w:t>
       </w:r>
     </w:p>
     <w:p>
@@ -1793,7 +1793,7 @@
                 <w:i w:val="0"/>
                 <w:sz w:val="20"/>
               </w:rPr>
-              <w:t>Dossier</w:t>
+              <w:t>Brief</w:t>
             </w:r>
           </w:p>
         </w:tc>
@@ -1810,7 +1810,7 @@
                 <w:i w:val="0"/>
                 <w:sz w:val="20"/>
               </w:rPr>
-              <w:t>Compiled dossier / Compiled from the live SAP reads.</w:t>
+              <w:t>Compiled brief / Compiled from the live SAP reads.</w:t>
             </w:r>
           </w:p>
         </w:tc>
@@ -1829,7 +1829,7 @@
                 <w:i w:val="0"/>
                 <w:sz w:val="20"/>
               </w:rPr>
-              <w:t>Dossier actions</w:t>
+              <w:t>Brief actions</w:t>
             </w:r>
           </w:p>
         </w:tc>
@@ -2055,7 +2055,7 @@
           <w:i w:val="0"/>
           <w:sz w:val="22"/>
         </w:rPr>
-        <w:t>1:30 — Dossier + Read selected requisition + Summarise. “One short model call. Two sentences. Nothing invented.”</w:t>
+        <w:t>1:30 — Brief + Read selected requisition + Summarise. “One short model call. Two sentences. Nothing invented.”</w:t>
       </w:r>
     </w:p>
     <w:p>

</xml_diff>

<commit_message>
docs(ops): Faycal playbook matches sealed BAPI ZLPO compose
Proof 3 is bapi_po BAPI_PO_CREATE1 type ZLPO, not hikma NB.
Write stays sealed. TESTRUN is banned.

Co-authored-by: thibaud.ishacian <thibaud.ishacian@gmail.com>
</commit_message>
<xml_diff>
--- a/docs/ops/nawa-pr-to-po-live-demo-playbook.docx
+++ b/docs/ops/nawa-pr-to-po-live-demo-playbook.docx
@@ -574,7 +574,7 @@
                 <w:i w:val="0"/>
                 <w:sz w:val="20"/>
               </w:rPr>
-              <w:t>hikma post_A_PurchaseOrder, type NB, Send Sealed. JSON sealed: true, called: false. Client 300 has no NB range; ZAPO is refused. Success = composed POST, not a live create.</w:t>
+              <w:t>bapi_po BAPI_PO_CREATE1, type ZLPO, Send Sealed. JSON sealed: true, called: false, testrun: false. Purch org = plant. TESTRUN is banned. Success = composed BAPI, not a live create.</w:t>
             </w:r>
           </w:p>
         </w:tc>
@@ -644,7 +644,7 @@
                 <w:i w:val="0"/>
                 <w:sz w:val="20"/>
               </w:rPr>
-              <w:t>Read-only. Chips: Majority supplier, Orders read, Next step, Write status. The write stays sealed.</w:t>
+              <w:t>Read-only. Chips: Plant supplier, Orders read, Next step, Write status. The write stays sealed.</w:t>
             </w:r>
           </w:p>
         </w:tc>
@@ -695,7 +695,7 @@
           <w:i w:val="0"/>
           <w:sz w:val="22"/>
         </w:rPr>
-        <w:t>Click Run the factory. Wait until Compile is Done and the hero reads something like “Brief compiled on STICKER WHITE — majority supplier 1000001737.”</w:t>
+        <w:t>Click Run the factory. Wait until Compile is Done and the hero reads something like “Brief compiled on STICKER WHITE — plant supplier 1000000018.”</w:t>
       </w:r>
     </w:p>
     <w:p>
@@ -737,7 +737,7 @@
           <w:i w:val="0"/>
           <w:sz w:val="22"/>
         </w:rPr>
-        <w:t>Proof 3 — Scroll to Draft / Purchase order composed for SAP. Row: POST · hikma · post_A_PurchaseOrder · Send Sealed. Say: this is the POST we would send; it is not sent.</w:t>
+        <w:t>Proof 3 — Scroll to Draft / Purchase order composed for SAP. Row: POST · bapi_po · BAPI_PO_CREATE1 · Send Sealed. Say: this is the BAPI we would send; it is not sent. Type ZLPO.</w:t>
       </w:r>
     </w:p>
     <w:p>
@@ -971,7 +971,7 @@
           <w:i w:val="0"/>
           <w:sz w:val="22"/>
         </w:rPr>
-        <w:t>Row: Method POST · Server hikma · Tool post_A_PurchaseOrder · Send Sealed.</w:t>
+        <w:t>Row: Method POST · Server bapi_po · Tool BAPI_PO_CREATE1 · Send Sealed.</w:t>
       </w:r>
     </w:p>
     <w:p>
@@ -985,7 +985,7 @@
           <w:i w:val="0"/>
           <w:sz w:val="22"/>
         </w:rPr>
-        <w:t>Footnote: Client 300 has no NB number range. The API refuses ZAPO.</w:t>
+        <w:t>Footnote: Write stays sealed. BAPI_PO_CREATE1 type ZLPO then COMMIT. TESTRUN is banned.</w:t>
       </w:r>
     </w:p>
     <w:p>
@@ -1036,7 +1036,7 @@
           <w:color w:val="555555"/>
           <w:sz w:val="18"/>
         </w:rPr>
-        <w:t>Figure 3 — Draft hikma POST: type NB, sealed, not sent.</w:t>
+        <w:t>Figure 3 — Draft BAPI_PO_CREATE1: type ZLPO, sealed, not sent.</w:t>
       </w:r>
     </w:p>
     <w:p>
@@ -1264,7 +1264,7 @@
                 <w:i w:val="0"/>
                 <w:sz w:val="20"/>
               </w:rPr>
-              <w:t>Brief compiled on STICKER WHITE — majority supplier 1000001737.</w:t>
+              <w:t>Brief compiled on STICKER WHITE — plant supplier from the most recent plant PO.</w:t>
             </w:r>
           </w:p>
         </w:tc>
@@ -1535,7 +1535,7 @@
                 <w:i w:val="0"/>
                 <w:sz w:val="20"/>
               </w:rPr>
-              <w:t>Supplier / type (read)</w:t>
+              <w:t>Supplier / type</w:t>
             </w:r>
           </w:p>
         </w:tc>
@@ -1552,7 +1552,7 @@
                 <w:i w:val="0"/>
                 <w:sz w:val="20"/>
               </w:rPr>
-              <w:t>1000001737 / ZAPO via get_A_PurchaseOrder</w:t>
+              <w:t>Most recent plant PO / ZLPO (never NB, never ZSVO from history)</w:t>
             </w:r>
           </w:p>
         </w:tc>
@@ -1624,7 +1624,7 @@
                 <w:i w:val="0"/>
                 <w:sz w:val="20"/>
               </w:rPr>
-              <w:t>hikma post_A_PurchaseOrder, PurchaseOrderType NB, PurchasingOrganization CPO, sealed true, called false</w:t>
+              <w:t>bapi_po BAPI_PO_CREATE1, DOC_TYPE ZLPO, PURCH_ORG = plant, sealed true, called false, testrun false</w:t>
             </w:r>
           </w:p>
         </w:tc>
@@ -2069,7 +2069,7 @@
           <w:i w:val="0"/>
           <w:sz w:val="22"/>
         </w:rPr>
-        <w:t>3:00 — Draft card. “Type NB, sealed, not sent. Client 300 has no NB range.”</w:t>
+        <w:t>3:00 — Draft card. “Type ZLPO, BAPI_PO_CREATE1, sealed, not sent. TESTRUN banned.”</w:t>
       </w:r>
     </w:p>
     <w:p>
@@ -2239,7 +2239,7 @@
           <w:i w:val="0"/>
           <w:sz w:val="22"/>
         </w:rPr>
-        <w:t>Do not post a purchase order. No tools/call on post_A_PurchaseOrder.</w:t>
+        <w:t>Do not post a purchase order. No tools/call on BAPI_PO_CREATE1 or COMMIT. TESTRUN is banned.</w:t>
       </w:r>
     </w:p>
     <w:p>

</xml_diff>

<commit_message>
docs(ops): journal live BAPI ZLPO switch on 34731192
Record the VM switch, sealed-desk smoke, and Faycal playbook SHA
after agentium-*:347311924fab went live.

Co-authored-by: thibaud.ishacian <thibaud.ishacian@gmail.com>
</commit_message>
<xml_diff>
--- a/docs/ops/nawa-pr-to-po-live-demo-playbook.docx
+++ b/docs/ops/nawa-pr-to-po-live-demo-playbook.docx
@@ -40,7 +40,7 @@
           <w:i w:val="0"/>
           <w:sz w:val="22"/>
         </w:rPr>
-        <w:t>Live revision: cd40fe337285058120ec7236d587b1853ca72c42 (hard-reload the tab). Verified 31 August 2026.</w:t>
+        <w:t>Live revision: 347311924faba4fc6686a05c3318cb5d2415fa2a (hard-reload the tab). Verified 31 August 2026.</w:t>
       </w:r>
     </w:p>
     <w:p>
@@ -807,7 +807,7 @@
       <w:r>
         <w:drawing>
           <wp:inline xmlns:a="http://schemas.openxmlformats.org/drawingml/2006/main" xmlns:pic="http://schemas.openxmlformats.org/drawingml/2006/picture">
-            <wp:extent cx="5852160" cy="4876800"/>
+            <wp:extent cx="5852160" cy="5689600"/>
             <wp:docPr id="1" name="Picture 1"/>
             <wp:cNvGraphicFramePr>
               <a:graphicFrameLocks noChangeAspect="1"/>
@@ -828,7 +828,7 @@
                   <pic:spPr>
                     <a:xfrm>
                       <a:off x="0" y="0"/>
-                      <a:ext cx="5852160" cy="4876800"/>
+                      <a:ext cx="5852160" cy="5689600"/>
                     </a:xfrm>
                     <a:prstGeom prst="rect"/>
                   </pic:spPr>
@@ -877,7 +877,7 @@
       <w:r>
         <w:drawing>
           <wp:inline xmlns:a="http://schemas.openxmlformats.org/drawingml/2006/main" xmlns:pic="http://schemas.openxmlformats.org/drawingml/2006/picture">
-            <wp:extent cx="5852160" cy="12472416"/>
+            <wp:extent cx="5852160" cy="2085307"/>
             <wp:docPr id="2" name="Picture 2"/>
             <wp:cNvGraphicFramePr>
               <a:graphicFrameLocks noChangeAspect="1"/>
@@ -898,7 +898,7 @@
                   <pic:spPr>
                     <a:xfrm>
                       <a:off x="0" y="0"/>
-                      <a:ext cx="5852160" cy="12472416"/>
+                      <a:ext cx="5852160" cy="2085307"/>
                     </a:xfrm>
                     <a:prstGeom prst="rect"/>
                   </pic:spPr>
@@ -992,7 +992,7 @@
       <w:r>
         <w:drawing>
           <wp:inline xmlns:a="http://schemas.openxmlformats.org/drawingml/2006/main" xmlns:pic="http://schemas.openxmlformats.org/drawingml/2006/picture">
-            <wp:extent cx="5852160" cy="4876800"/>
+            <wp:extent cx="5852160" cy="2403566"/>
             <wp:docPr id="3" name="Picture 3"/>
             <wp:cNvGraphicFramePr>
               <a:graphicFrameLocks noChangeAspect="1"/>
@@ -1013,7 +1013,7 @@
                   <pic:spPr>
                     <a:xfrm>
                       <a:off x="0" y="0"/>
-                      <a:ext cx="5852160" cy="4876800"/>
+                      <a:ext cx="5852160" cy="2403566"/>
                     </a:xfrm>
                     <a:prstGeom prst="rect"/>
                   </pic:spPr>
@@ -1062,7 +1062,7 @@
       <w:r>
         <w:drawing>
           <wp:inline xmlns:a="http://schemas.openxmlformats.org/drawingml/2006/main" xmlns:pic="http://schemas.openxmlformats.org/drawingml/2006/picture">
-            <wp:extent cx="5852160" cy="4876800"/>
+            <wp:extent cx="5852160" cy="2083242"/>
             <wp:docPr id="4" name="Picture 4"/>
             <wp:cNvGraphicFramePr>
               <a:graphicFrameLocks noChangeAspect="1"/>
@@ -1071,11 +1071,11 @@
               <a:graphicData uri="http://schemas.openxmlformats.org/drawingml/2006/picture">
                 <pic:pic>
                   <pic:nvPicPr>
-                    <pic:cNvPr id="0" name="post.png"/>
+                    <pic:cNvPr id="0" name="ask.png"/>
                     <pic:cNvPicPr/>
                   </pic:nvPicPr>
                   <pic:blipFill>
-                    <a:blip r:embed="rId11"/>
+                    <a:blip r:embed="rId12"/>
                     <a:stretch>
                       <a:fillRect/>
                     </a:stretch>
@@ -1083,7 +1083,7 @@
                   <pic:spPr>
                     <a:xfrm>
                       <a:off x="0" y="0"/>
-                      <a:ext cx="5852160" cy="4876800"/>
+                      <a:ext cx="5852160" cy="2083242"/>
                     </a:xfrm>
                     <a:prstGeom prst="rect"/>
                   </pic:spPr>
@@ -1145,7 +1145,7 @@
                     <pic:cNvPicPr/>
                   </pic:nvPicPr>
                   <pic:blipFill>
-                    <a:blip r:embed="rId12"/>
+                    <a:blip r:embed="rId13"/>
                     <a:stretch>
                       <a:fillRect/>
                     </a:stretch>
@@ -1184,7 +1184,7 @@
         <w:pStyle w:val="Heading2"/>
       </w:pPr>
       <w:r>
-        <w:t>Live example (31 August 2026, SHA cd40fe33)</w:t>
+        <w:t>Live example (31 August 2026, SHA 34731192)</w:t>
       </w:r>
     </w:p>
     <w:tbl>
@@ -1264,7 +1264,7 @@
                 <w:i w:val="0"/>
                 <w:sz w:val="20"/>
               </w:rPr>
-              <w:t>Brief compiled on STICKER WHITE — plant supplier from the most recent plant PO.</w:t>
+              <w:t>Brief compiled on PAPER BAG — plant supplier 1000000018.</w:t>
             </w:r>
           </w:p>
         </w:tc>
@@ -1300,7 +1300,7 @@
                 <w:i w:val="0"/>
                 <w:sz w:val="20"/>
               </w:rPr>
-              <w:t>Requisitions 50 · Tasks 2 · Orders 5 · Receipts 0</w:t>
+              <w:t>Requisitions 50 · Tasks 2 · Orders 20 · Receipts 0</w:t>
             </w:r>
           </w:p>
         </w:tc>
@@ -1372,7 +1372,7 @@
                 <w:i w:val="0"/>
                 <w:sz w:val="20"/>
               </w:rPr>
-              <w:t>STICKER WHITE via get_A_PurchaseRequisitionItem</w:t>
+              <w:t>PAPER BAG via get_A_PurchaseRequisitionItem</w:t>
             </w:r>
           </w:p>
         </w:tc>
@@ -1444,7 +1444,7 @@
                 <w:i w:val="0"/>
                 <w:sz w:val="20"/>
               </w:rPr>
-              <w:t>2000276449 item 10</w:t>
+              <w:t>2000276449 item 00020</w:t>
             </w:r>
           </w:p>
         </w:tc>
@@ -1480,7 +1480,7 @@
                 <w:i w:val="0"/>
                 <w:sz w:val="20"/>
               </w:rPr>
-              <w:t>STICKER WHITE via get_A_PurchaseRequisitionItem_by_key</w:t>
+              <w:t>STICKER WHITE via get_A_PurchaseRequisitionItem_by_key (item text on this PR is not always the selected line)</w:t>
             </w:r>
           </w:p>
         </w:tc>
@@ -1516,7 +1516,7 @@
                 <w:i w:val="0"/>
                 <w:sz w:val="20"/>
               </w:rPr>
-              <w:t>The purchase requisition is for white stickers. No additional justification details are provided in the text. via azure_llm_v1</w:t>
+              <w:t>The request is to purchase white stickers. No further justification details are provided in the text. via azure_llm_v1</w:t>
             </w:r>
           </w:p>
         </w:tc>
@@ -1552,7 +1552,7 @@
                 <w:i w:val="0"/>
                 <w:sz w:val="20"/>
               </w:rPr>
-              <w:t>Most recent plant PO / ZLPO (never NB, never ZSVO from history)</w:t>
+              <w:t>Most recent plant PO 1000000018 / ZLPO (never NB, never ZSVO from history)</w:t>
             </w:r>
           </w:p>
         </w:tc>
@@ -1624,7 +1624,7 @@
                 <w:i w:val="0"/>
                 <w:sz w:val="20"/>
               </w:rPr>
-              <w:t>bapi_po BAPI_PO_CREATE1, DOC_TYPE ZLPO, PURCH_ORG = plant, sealed true, called false, testrun false</w:t>
+              <w:t>bapi_po BAPI_PO_CREATE1, DOC_TYPE ZLPO, PURCH_ORG = COMP_CODE = 1000, sealed true, called false, testrun false</w:t>
             </w:r>
           </w:p>
         </w:tc>
@@ -1918,7 +1918,7 @@
                 <w:i w:val="0"/>
                 <w:sz w:val="20"/>
               </w:rPr>
-              <w:t>Majority supplier · Orders read · Next step · Write status</w:t>
+              <w:t>Plant supplier · Orders read · Next step · Write status</w:t>
             </w:r>
           </w:p>
         </w:tc>
@@ -2345,7 +2345,7 @@
           <w:i w:val="0"/>
           <w:sz w:val="22"/>
         </w:rPr>
-        <w:t>Images agentium-{backend,worker,frontend}:cd40fe337285</w:t>
+        <w:t>Images agentium-{backend,worker,frontend}:347311924fab</w:t>
       </w:r>
     </w:p>
     <w:p>
@@ -2359,7 +2359,7 @@
           <w:i w:val="0"/>
           <w:sz w:val="22"/>
         </w:rPr>
-        <w:t>Rollback of this desk slice: AGENTIUM_IMAGE_TAG=3eb72f95f6b6</w:t>
+        <w:t>Rollback of this desk slice: AGENTIUM_IMAGE_TAG=cd40fe337285</w:t>
       </w:r>
     </w:p>
     <w:p>

</xml_diff>